<commit_message>
Docs: add pre-processing steps to the workflows document
Co-Authored-By: Claude Opus 5.5 <noreply@anthropic.com>
</commit_message>
<xml_diff>
--- a/docs/Agentic AI SaaS - Workflows etc.docx
+++ b/docs/Agentic AI SaaS - Workflows etc.docx
@@ -3307,6 +3307,1438 @@
                 <w:szCs w:val="19"/>
               </w:rPr>
               <w:t xml:space="preserve">StreamController.ts</w:t>
+            </w:r>
+          </w:p>
+        </w:tc>
+      </w:tr>
+    </w:tbl>
+    <w:p>
+      <w:pPr>
+        <w:spacing w:after="120"/>
+      </w:pPr>
+    </w:p>
+    <w:p>
+      <w:pPr>
+        <w:pStyle w:val="Heading2"/>
+      </w:pPr>
+      <w:r>
+        <w:t xml:space="preserve">Pre-processing: what happens before a model sees any data</w:t>
+      </w:r>
+    </w:p>
+    <w:p>
+      <w:pPr>
+        <w:spacing w:after="120"/>
+      </w:pPr>
+      <w:r>
+        <w:t xml:space="preserve">Claude never sees raw provider output or raw user input. Each item passes these steps in order:</w:t>
+      </w:r>
+    </w:p>
+    <w:tbl>
+      <w:tblPr>
+        <w:tblW w:type="dxa" w:w="9026"/>
+        <w:tblBorders>
+          <w:top w:val="single" w:color="auto" w:sz="4"/>
+          <w:left w:val="single" w:color="auto" w:sz="4"/>
+          <w:bottom w:val="single" w:color="auto" w:sz="4"/>
+          <w:right w:val="single" w:color="auto" w:sz="4"/>
+          <w:insideH w:val="single" w:color="auto" w:sz="4"/>
+          <w:insideV w:val="single" w:color="auto" w:sz="4"/>
+        </w:tblBorders>
+      </w:tblPr>
+      <w:tblGrid>
+        <w:gridCol w:w="564"/>
+        <w:gridCol w:w="1692"/>
+        <w:gridCol w:w="2256"/>
+        <w:gridCol w:w="4514"/>
+      </w:tblGrid>
+      <w:tr>
+        <w:trPr>
+          <w:tblHeader/>
+        </w:trPr>
+        <w:tc>
+          <w:tcPr>
+            <w:tcW w:type="dxa" w:w="564"/>
+            <w:tcBorders>
+              <w:top w:val="single" w:color="B7C3D0" w:sz="4"/>
+              <w:left w:val="single" w:color="B7C3D0" w:sz="4"/>
+              <w:bottom w:val="single" w:color="B7C3D0" w:sz="4"/>
+              <w:right w:val="single" w:color="B7C3D0" w:sz="4"/>
+            </w:tcBorders>
+            <w:shd w:fill="1F3A5F" w:color="auto" w:val="clear"/>
+            <w:tcMar>
+              <w:top w:type="dxa" w:w="60"/>
+              <w:left w:type="dxa" w:w="100"/>
+              <w:bottom w:type="dxa" w:w="60"/>
+              <w:right w:type="dxa" w:w="100"/>
+            </w:tcMar>
+          </w:tcPr>
+          <w:p>
+            <w:r>
+              <w:rPr>
+                <w:b/>
+                <w:bCs/>
+                <w:color w:val="FFFFFF"/>
+              </w:rPr>
+              <w:t xml:space="preserve">#</w:t>
+            </w:r>
+          </w:p>
+        </w:tc>
+        <w:tc>
+          <w:tcPr>
+            <w:tcW w:type="dxa" w:w="1692"/>
+            <w:tcBorders>
+              <w:top w:val="single" w:color="B7C3D0" w:sz="4"/>
+              <w:left w:val="single" w:color="B7C3D0" w:sz="4"/>
+              <w:bottom w:val="single" w:color="B7C3D0" w:sz="4"/>
+              <w:right w:val="single" w:color="B7C3D0" w:sz="4"/>
+            </w:tcBorders>
+            <w:shd w:fill="1F3A5F" w:color="auto" w:val="clear"/>
+            <w:tcMar>
+              <w:top w:type="dxa" w:w="60"/>
+              <w:left w:type="dxa" w:w="100"/>
+              <w:bottom w:type="dxa" w:w="60"/>
+              <w:right w:type="dxa" w:w="100"/>
+            </w:tcMar>
+          </w:tcPr>
+          <w:p>
+            <w:r>
+              <w:rPr>
+                <w:b/>
+                <w:bCs/>
+                <w:color w:val="FFFFFF"/>
+              </w:rPr>
+              <w:t xml:space="preserve">Step</w:t>
+            </w:r>
+          </w:p>
+        </w:tc>
+        <w:tc>
+          <w:tcPr>
+            <w:tcW w:type="dxa" w:w="2256"/>
+            <w:tcBorders>
+              <w:top w:val="single" w:color="B7C3D0" w:sz="4"/>
+              <w:left w:val="single" w:color="B7C3D0" w:sz="4"/>
+              <w:bottom w:val="single" w:color="B7C3D0" w:sz="4"/>
+              <w:right w:val="single" w:color="B7C3D0" w:sz="4"/>
+            </w:tcBorders>
+            <w:shd w:fill="1F3A5F" w:color="auto" w:val="clear"/>
+            <w:tcMar>
+              <w:top w:type="dxa" w:w="60"/>
+              <w:left w:type="dxa" w:w="100"/>
+              <w:bottom w:type="dxa" w:w="60"/>
+              <w:right w:type="dxa" w:w="100"/>
+            </w:tcMar>
+          </w:tcPr>
+          <w:p>
+            <w:r>
+              <w:rPr>
+                <w:b/>
+                <w:bCs/>
+                <w:color w:val="FFFFFF"/>
+              </w:rPr>
+              <w:t xml:space="preserve">Where</w:t>
+            </w:r>
+          </w:p>
+        </w:tc>
+        <w:tc>
+          <w:tcPr>
+            <w:tcW w:type="dxa" w:w="4514"/>
+            <w:tcBorders>
+              <w:top w:val="single" w:color="B7C3D0" w:sz="4"/>
+              <w:left w:val="single" w:color="B7C3D0" w:sz="4"/>
+              <w:bottom w:val="single" w:color="B7C3D0" w:sz="4"/>
+              <w:right w:val="single" w:color="B7C3D0" w:sz="4"/>
+            </w:tcBorders>
+            <w:shd w:fill="1F3A5F" w:color="auto" w:val="clear"/>
+            <w:tcMar>
+              <w:top w:type="dxa" w:w="60"/>
+              <w:left w:type="dxa" w:w="100"/>
+              <w:bottom w:type="dxa" w:w="60"/>
+              <w:right w:type="dxa" w:w="100"/>
+            </w:tcMar>
+          </w:tcPr>
+          <w:p>
+            <w:r>
+              <w:rPr>
+                <w:b/>
+                <w:bCs/>
+                <w:color w:val="FFFFFF"/>
+              </w:rPr>
+              <w:t xml:space="preserve">What it does</w:t>
+            </w:r>
+          </w:p>
+        </w:tc>
+      </w:tr>
+      <w:tr>
+        <w:tc>
+          <w:tcPr>
+            <w:tcW w:type="dxa" w:w="564"/>
+            <w:tcBorders>
+              <w:top w:val="single" w:color="B7C3D0" w:sz="4"/>
+              <w:left w:val="single" w:color="B7C3D0" w:sz="4"/>
+              <w:bottom w:val="single" w:color="B7C3D0" w:sz="4"/>
+              <w:right w:val="single" w:color="B7C3D0" w:sz="4"/>
+            </w:tcBorders>
+            <w:tcMar>
+              <w:top w:type="dxa" w:w="60"/>
+              <w:left w:type="dxa" w:w="100"/>
+              <w:bottom w:type="dxa" w:w="60"/>
+              <w:right w:type="dxa" w:w="100"/>
+            </w:tcMar>
+          </w:tcPr>
+          <w:p>
+            <w:r>
+              <w:t xml:space="preserve">1</w:t>
+            </w:r>
+          </w:p>
+        </w:tc>
+        <w:tc>
+          <w:tcPr>
+            <w:tcW w:type="dxa" w:w="1692"/>
+            <w:tcBorders>
+              <w:top w:val="single" w:color="B7C3D0" w:sz="4"/>
+              <w:left w:val="single" w:color="B7C3D0" w:sz="4"/>
+              <w:bottom w:val="single" w:color="B7C3D0" w:sz="4"/>
+              <w:right w:val="single" w:color="B7C3D0" w:sz="4"/>
+            </w:tcBorders>
+            <w:tcMar>
+              <w:top w:type="dxa" w:w="60"/>
+              <w:left w:type="dxa" w:w="100"/>
+              <w:bottom w:type="dxa" w:w="60"/>
+              <w:right w:type="dxa" w:w="100"/>
+            </w:tcMar>
+          </w:tcPr>
+          <w:p>
+            <w:r>
+              <w:t xml:space="preserve">Validate the request</w:t>
+            </w:r>
+          </w:p>
+        </w:tc>
+        <w:tc>
+          <w:tcPr>
+            <w:tcW w:type="dxa" w:w="2256"/>
+            <w:tcBorders>
+              <w:top w:val="single" w:color="B7C3D0" w:sz="4"/>
+              <w:left w:val="single" w:color="B7C3D0" w:sz="4"/>
+              <w:bottom w:val="single" w:color="B7C3D0" w:sz="4"/>
+              <w:right w:val="single" w:color="B7C3D0" w:sz="4"/>
+            </w:tcBorders>
+            <w:tcMar>
+              <w:top w:type="dxa" w:w="60"/>
+              <w:left w:type="dxa" w:w="100"/>
+              <w:bottom w:type="dxa" w:w="60"/>
+              <w:right w:type="dxa" w:w="100"/>
+            </w:tcMar>
+          </w:tcPr>
+          <w:p>
+            <w:r>
+              <w:rPr>
+                <w:rFonts w:ascii="Consolas" w:cs="Consolas" w:eastAsia="Consolas" w:hAnsi="Consolas"/>
+                <w:color w:val="1F3A5F"/>
+                <w:sz w:val="19"/>
+                <w:szCs w:val="19"/>
+              </w:rPr>
+              <w:t xml:space="preserve">api/schemas/research.py</w:t>
+            </w:r>
+            <w:r>
+              <w:t xml:space="preserve">, </w:t>
+            </w:r>
+            <w:r>
+              <w:rPr>
+                <w:rFonts w:ascii="Consolas" w:cs="Consolas" w:eastAsia="Consolas" w:hAnsi="Consolas"/>
+                <w:color w:val="1F3A5F"/>
+                <w:sz w:val="19"/>
+                <w:szCs w:val="19"/>
+              </w:rPr>
+              <w:t xml:space="preserve">ResearchService.estimate</w:t>
+            </w:r>
+          </w:p>
+        </w:tc>
+        <w:tc>
+          <w:tcPr>
+            <w:tcW w:type="dxa" w:w="4514"/>
+            <w:tcBorders>
+              <w:top w:val="single" w:color="B7C3D0" w:sz="4"/>
+              <w:left w:val="single" w:color="B7C3D0" w:sz="4"/>
+              <w:bottom w:val="single" w:color="B7C3D0" w:sz="4"/>
+              <w:right w:val="single" w:color="B7C3D0" w:sz="4"/>
+            </w:tcBorders>
+            <w:tcMar>
+              <w:top w:type="dxa" w:w="60"/>
+              <w:left w:type="dxa" w:w="100"/>
+              <w:bottom w:type="dxa" w:w="60"/>
+              <w:right w:type="dxa" w:w="100"/>
+            </w:tcMar>
+          </w:tcPr>
+          <w:p>
+            <w:r>
+              <w:t xml:space="preserve">Pydantic checks the instrument, horizon, profile and question length; </w:t>
+            </w:r>
+            <w:r>
+              <w:rPr>
+                <w:rFonts w:ascii="Consolas" w:cs="Consolas" w:eastAsia="Consolas" w:hAnsi="Consolas"/>
+                <w:color w:val="1F3A5F"/>
+                <w:sz w:val="19"/>
+                <w:szCs w:val="19"/>
+              </w:rPr>
+              <w:t xml:space="preserve">fingerprint()</w:t>
+            </w:r>
+            <w:r>
+              <w:t xml:space="preserve"> hashes the request so the estimate can't be swapped.</w:t>
+            </w:r>
+          </w:p>
+        </w:tc>
+      </w:tr>
+      <w:tr>
+        <w:tc>
+          <w:tcPr>
+            <w:tcW w:type="dxa" w:w="564"/>
+            <w:tcBorders>
+              <w:top w:val="single" w:color="B7C3D0" w:sz="4"/>
+              <w:left w:val="single" w:color="B7C3D0" w:sz="4"/>
+              <w:bottom w:val="single" w:color="B7C3D0" w:sz="4"/>
+              <w:right w:val="single" w:color="B7C3D0" w:sz="4"/>
+            </w:tcBorders>
+            <w:tcMar>
+              <w:top w:type="dxa" w:w="60"/>
+              <w:left w:type="dxa" w:w="100"/>
+              <w:bottom w:type="dxa" w:w="60"/>
+              <w:right w:type="dxa" w:w="100"/>
+            </w:tcMar>
+          </w:tcPr>
+          <w:p>
+            <w:r>
+              <w:t xml:space="preserve">2</w:t>
+            </w:r>
+          </w:p>
+        </w:tc>
+        <w:tc>
+          <w:tcPr>
+            <w:tcW w:type="dxa" w:w="1692"/>
+            <w:tcBorders>
+              <w:top w:val="single" w:color="B7C3D0" w:sz="4"/>
+              <w:left w:val="single" w:color="B7C3D0" w:sz="4"/>
+              <w:bottom w:val="single" w:color="B7C3D0" w:sz="4"/>
+              <w:right w:val="single" w:color="B7C3D0" w:sz="4"/>
+            </w:tcBorders>
+            <w:tcMar>
+              <w:top w:type="dxa" w:w="60"/>
+              <w:left w:type="dxa" w:w="100"/>
+              <w:bottom w:type="dxa" w:w="60"/>
+              <w:right w:type="dxa" w:w="100"/>
+            </w:tcMar>
+          </w:tcPr>
+          <w:p>
+            <w:r>
+              <w:t xml:space="preserve">Freeze the run snapshot</w:t>
+            </w:r>
+          </w:p>
+        </w:tc>
+        <w:tc>
+          <w:tcPr>
+            <w:tcW w:type="dxa" w:w="2256"/>
+            <w:tcBorders>
+              <w:top w:val="single" w:color="B7C3D0" w:sz="4"/>
+              <w:left w:val="single" w:color="B7C3D0" w:sz="4"/>
+              <w:bottom w:val="single" w:color="B7C3D0" w:sz="4"/>
+              <w:right w:val="single" w:color="B7C3D0" w:sz="4"/>
+            </w:tcBorders>
+            <w:tcMar>
+              <w:top w:type="dxa" w:w="60"/>
+              <w:left w:type="dxa" w:w="100"/>
+              <w:bottom w:type="dxa" w:w="60"/>
+              <w:right w:type="dxa" w:w="100"/>
+            </w:tcMar>
+          </w:tcPr>
+          <w:p>
+            <w:r>
+              <w:rPr>
+                <w:rFonts w:ascii="Consolas" w:cs="Consolas" w:eastAsia="Consolas" w:hAnsi="Consolas"/>
+                <w:color w:val="1F3A5F"/>
+                <w:sz w:val="19"/>
+                <w:szCs w:val="19"/>
+              </w:rPr>
+              <w:t xml:space="preserve">ResearchService.admit</w:t>
+            </w:r>
+            <w:r>
+              <w:t xml:space="preserve">, </w:t>
+            </w:r>
+            <w:r>
+              <w:rPr>
+                <w:rFonts w:ascii="Consolas" w:cs="Consolas" w:eastAsia="Consolas" w:hAnsi="Consolas"/>
+                <w:color w:val="1F3A5F"/>
+                <w:sz w:val="19"/>
+                <w:szCs w:val="19"/>
+              </w:rPr>
+              <w:t xml:space="preserve">workflows/versions.py</w:t>
+            </w:r>
+          </w:p>
+        </w:tc>
+        <w:tc>
+          <w:tcPr>
+            <w:tcW w:type="dxa" w:w="4514"/>
+            <w:tcBorders>
+              <w:top w:val="single" w:color="B7C3D0" w:sz="4"/>
+              <w:left w:val="single" w:color="B7C3D0" w:sz="4"/>
+              <w:bottom w:val="single" w:color="B7C3D0" w:sz="4"/>
+              <w:right w:val="single" w:color="B7C3D0" w:sz="4"/>
+            </w:tcBorders>
+            <w:tcMar>
+              <w:top w:type="dxa" w:w="60"/>
+              <w:left w:type="dxa" w:w="100"/>
+              <w:bottom w:type="dxa" w:w="60"/>
+              <w:right w:type="dxa" w:w="100"/>
+            </w:tcMar>
+          </w:tcPr>
+          <w:p>
+            <w:r>
+              <w:t xml:space="preserve">Copies the instrument, horizon, approved models, limits and rate-card version into the run (</w:t>
+            </w:r>
+            <w:r>
+              <w:rPr>
+                <w:rFonts w:ascii="Consolas" w:cs="Consolas" w:eastAsia="Consolas" w:hAnsi="Consolas"/>
+                <w:color w:val="1F3A5F"/>
+                <w:sz w:val="19"/>
+                <w:szCs w:val="19"/>
+              </w:rPr>
+              <w:t xml:space="preserve">instrument_snapshot</w:t>
+            </w:r>
+            <w:r>
+              <w:t xml:space="preserve">); </w:t>
+            </w:r>
+            <w:r>
+              <w:rPr>
+                <w:rFonts w:ascii="Consolas" w:cs="Consolas" w:eastAsia="Consolas" w:hAnsi="Consolas"/>
+                <w:color w:val="1F3A5F"/>
+                <w:sz w:val="19"/>
+                <w:szCs w:val="19"/>
+              </w:rPr>
+              <w:t xml:space="preserve">run_versions</w:t>
+            </w:r>
+            <w:r>
+              <w:t xml:space="preserve"> stores prompt and graph versions (</w:t>
+            </w:r>
+            <w:r>
+              <w:rPr>
+                <w:rFonts w:ascii="Consolas" w:cs="Consolas" w:eastAsia="Consolas" w:hAnsi="Consolas"/>
+                <w:color w:val="1F3A5F"/>
+                <w:sz w:val="19"/>
+                <w:szCs w:val="19"/>
+              </w:rPr>
+              <w:t xml:space="preserve">prompt_version</w:t>
+            </w:r>
+            <w:r>
+              <w:t xml:space="preserve"> = sha256 of </w:t>
+            </w:r>
+            <w:r>
+              <w:rPr>
+                <w:rFonts w:ascii="Consolas" w:cs="Consolas" w:eastAsia="Consolas" w:hAnsi="Consolas"/>
+                <w:color w:val="1F3A5F"/>
+                <w:sz w:val="19"/>
+                <w:szCs w:val="19"/>
+              </w:rPr>
+              <w:t xml:space="preserve">agents/prompts/*.md</w:t>
+            </w:r>
+            <w:r>
+              <w:t xml:space="preserve">).</w:t>
+            </w:r>
+          </w:p>
+        </w:tc>
+      </w:tr>
+      <w:tr>
+        <w:tc>
+          <w:tcPr>
+            <w:tcW w:type="dxa" w:w="564"/>
+            <w:tcBorders>
+              <w:top w:val="single" w:color="B7C3D0" w:sz="4"/>
+              <w:left w:val="single" w:color="B7C3D0" w:sz="4"/>
+              <w:bottom w:val="single" w:color="B7C3D0" w:sz="4"/>
+              <w:right w:val="single" w:color="B7C3D0" w:sz="4"/>
+            </w:tcBorders>
+            <w:tcMar>
+              <w:top w:type="dxa" w:w="60"/>
+              <w:left w:type="dxa" w:w="100"/>
+              <w:bottom w:type="dxa" w:w="60"/>
+              <w:right w:type="dxa" w:w="100"/>
+            </w:tcMar>
+          </w:tcPr>
+          <w:p>
+            <w:r>
+              <w:t xml:space="preserve">3</w:t>
+            </w:r>
+          </w:p>
+        </w:tc>
+        <w:tc>
+          <w:tcPr>
+            <w:tcW w:type="dxa" w:w="1692"/>
+            <w:tcBorders>
+              <w:top w:val="single" w:color="B7C3D0" w:sz="4"/>
+              <w:left w:val="single" w:color="B7C3D0" w:sz="4"/>
+              <w:bottom w:val="single" w:color="B7C3D0" w:sz="4"/>
+              <w:right w:val="single" w:color="B7C3D0" w:sz="4"/>
+            </w:tcBorders>
+            <w:tcMar>
+              <w:top w:type="dxa" w:w="60"/>
+              <w:left w:type="dxa" w:w="100"/>
+              <w:bottom w:type="dxa" w:w="60"/>
+              <w:right w:type="dxa" w:w="100"/>
+            </w:tcMar>
+          </w:tcPr>
+          <w:p>
+            <w:r>
+              <w:t xml:space="preserve">Resolve the symbol</w:t>
+            </w:r>
+          </w:p>
+        </w:tc>
+        <w:tc>
+          <w:tcPr>
+            <w:tcW w:type="dxa" w:w="2256"/>
+            <w:tcBorders>
+              <w:top w:val="single" w:color="B7C3D0" w:sz="4"/>
+              <w:left w:val="single" w:color="B7C3D0" w:sz="4"/>
+              <w:bottom w:val="single" w:color="B7C3D0" w:sz="4"/>
+              <w:right w:val="single" w:color="B7C3D0" w:sz="4"/>
+            </w:tcBorders>
+            <w:tcMar>
+              <w:top w:type="dxa" w:w="60"/>
+              <w:left w:type="dxa" w:w="100"/>
+              <w:bottom w:type="dxa" w:w="60"/>
+              <w:right w:type="dxa" w:w="100"/>
+            </w:tcMar>
+          </w:tcPr>
+          <w:p>
+            <w:r>
+              <w:rPr>
+                <w:rFonts w:ascii="Consolas" w:cs="Consolas" w:eastAsia="Consolas" w:hAnsi="Consolas"/>
+                <w:color w:val="1F3A5F"/>
+                <w:sz w:val="19"/>
+                <w:szCs w:val="19"/>
+              </w:rPr>
+              <w:t xml:space="preserve">ToolService</w:t>
+            </w:r>
+          </w:p>
+        </w:tc>
+        <w:tc>
+          <w:tcPr>
+            <w:tcW w:type="dxa" w:w="4514"/>
+            <w:tcBorders>
+              <w:top w:val="single" w:color="B7C3D0" w:sz="4"/>
+              <w:left w:val="single" w:color="B7C3D0" w:sz="4"/>
+              <w:bottom w:val="single" w:color="B7C3D0" w:sz="4"/>
+              <w:right w:val="single" w:color="B7C3D0" w:sz="4"/>
+            </w:tcBorders>
+            <w:tcMar>
+              <w:top w:type="dxa" w:w="60"/>
+              <w:left w:type="dxa" w:w="100"/>
+              <w:bottom w:type="dxa" w:w="60"/>
+              <w:right w:type="dxa" w:w="100"/>
+            </w:tcMar>
+          </w:tcPr>
+          <w:p>
+            <w:r>
+              <w:t xml:space="preserve">Maps the catalog instrument (enabled only) to the provider's symbol via </w:t>
+            </w:r>
+            <w:r>
+              <w:rPr>
+                <w:rFonts w:ascii="Consolas" w:cs="Consolas" w:eastAsia="Consolas" w:hAnsi="Consolas"/>
+                <w:color w:val="1F3A5F"/>
+                <w:sz w:val="19"/>
+                <w:szCs w:val="19"/>
+              </w:rPr>
+              <w:t xml:space="preserve">provider_mappings</w:t>
+            </w:r>
+            <w:r>
+              <w:t xml:space="preserve">; the model never chooses the instrument.</w:t>
+            </w:r>
+          </w:p>
+        </w:tc>
+      </w:tr>
+      <w:tr>
+        <w:tc>
+          <w:tcPr>
+            <w:tcW w:type="dxa" w:w="564"/>
+            <w:tcBorders>
+              <w:top w:val="single" w:color="B7C3D0" w:sz="4"/>
+              <w:left w:val="single" w:color="B7C3D0" w:sz="4"/>
+              <w:bottom w:val="single" w:color="B7C3D0" w:sz="4"/>
+              <w:right w:val="single" w:color="B7C3D0" w:sz="4"/>
+            </w:tcBorders>
+            <w:tcMar>
+              <w:top w:type="dxa" w:w="60"/>
+              <w:left w:type="dxa" w:w="100"/>
+              <w:bottom w:type="dxa" w:w="60"/>
+              <w:right w:type="dxa" w:w="100"/>
+            </w:tcMar>
+          </w:tcPr>
+          <w:p>
+            <w:r>
+              <w:t xml:space="preserve">4</w:t>
+            </w:r>
+          </w:p>
+        </w:tc>
+        <w:tc>
+          <w:tcPr>
+            <w:tcW w:type="dxa" w:w="1692"/>
+            <w:tcBorders>
+              <w:top w:val="single" w:color="B7C3D0" w:sz="4"/>
+              <w:left w:val="single" w:color="B7C3D0" w:sz="4"/>
+              <w:bottom w:val="single" w:color="B7C3D0" w:sz="4"/>
+              <w:right w:val="single" w:color="B7C3D0" w:sz="4"/>
+            </w:tcBorders>
+            <w:tcMar>
+              <w:top w:type="dxa" w:w="60"/>
+              <w:left w:type="dxa" w:w="100"/>
+              <w:bottom w:type="dxa" w:w="60"/>
+              <w:right w:type="dxa" w:w="100"/>
+            </w:tcMar>
+          </w:tcPr>
+          <w:p>
+            <w:r>
+              <w:t xml:space="preserve">Fetch with limits</w:t>
+            </w:r>
+          </w:p>
+        </w:tc>
+        <w:tc>
+          <w:tcPr>
+            <w:tcW w:type="dxa" w:w="2256"/>
+            <w:tcBorders>
+              <w:top w:val="single" w:color="B7C3D0" w:sz="4"/>
+              <w:left w:val="single" w:color="B7C3D0" w:sz="4"/>
+              <w:bottom w:val="single" w:color="B7C3D0" w:sz="4"/>
+              <w:right w:val="single" w:color="B7C3D0" w:sz="4"/>
+            </w:tcBorders>
+            <w:tcMar>
+              <w:top w:type="dxa" w:w="60"/>
+              <w:left w:type="dxa" w:w="100"/>
+              <w:bottom w:type="dxa" w:w="60"/>
+              <w:right w:type="dxa" w:w="100"/>
+            </w:tcMar>
+          </w:tcPr>
+          <w:p>
+            <w:r>
+              <w:rPr>
+                <w:rFonts w:ascii="Consolas" w:cs="Consolas" w:eastAsia="Consolas" w:hAnsi="Consolas"/>
+                <w:color w:val="1F3A5F"/>
+                <w:sz w:val="19"/>
+                <w:szCs w:val="19"/>
+              </w:rPr>
+              <w:t xml:space="preserve">ToolService</w:t>
+            </w:r>
+            <w:r>
+              <w:t xml:space="preserve">, </w:t>
+            </w:r>
+            <w:r>
+              <w:rPr>
+                <w:rFonts w:ascii="Consolas" w:cs="Consolas" w:eastAsia="Consolas" w:hAnsi="Consolas"/>
+                <w:color w:val="1F3A5F"/>
+                <w:sz w:val="19"/>
+                <w:szCs w:val="19"/>
+              </w:rPr>
+              <w:t xml:space="preserve">SafeHttpClient</w:t>
+            </w:r>
+          </w:p>
+        </w:tc>
+        <w:tc>
+          <w:tcPr>
+            <w:tcW w:type="dxa" w:w="4514"/>
+            <w:tcBorders>
+              <w:top w:val="single" w:color="B7C3D0" w:sz="4"/>
+              <w:left w:val="single" w:color="B7C3D0" w:sz="4"/>
+              <w:bottom w:val="single" w:color="B7C3D0" w:sz="4"/>
+              <w:right w:val="single" w:color="B7C3D0" w:sz="4"/>
+            </w:tcBorders>
+            <w:tcMar>
+              <w:top w:type="dxa" w:w="60"/>
+              <w:left w:type="dxa" w:w="100"/>
+              <w:bottom w:type="dxa" w:w="60"/>
+              <w:right w:type="dxa" w:w="100"/>
+            </w:tcMar>
+          </w:tcPr>
+          <w:p>
+            <w:r>
+              <w:t xml:space="preserve">8 s deadline, at most two retries for transient reads, egress policy; results cached in Redis (news for 10 min).</w:t>
+            </w:r>
+          </w:p>
+        </w:tc>
+      </w:tr>
+      <w:tr>
+        <w:tc>
+          <w:tcPr>
+            <w:tcW w:type="dxa" w:w="564"/>
+            <w:tcBorders>
+              <w:top w:val="single" w:color="B7C3D0" w:sz="4"/>
+              <w:left w:val="single" w:color="B7C3D0" w:sz="4"/>
+              <w:bottom w:val="single" w:color="B7C3D0" w:sz="4"/>
+              <w:right w:val="single" w:color="B7C3D0" w:sz="4"/>
+            </w:tcBorders>
+            <w:tcMar>
+              <w:top w:type="dxa" w:w="60"/>
+              <w:left w:type="dxa" w:w="100"/>
+              <w:bottom w:type="dxa" w:w="60"/>
+              <w:right w:type="dxa" w:w="100"/>
+            </w:tcMar>
+          </w:tcPr>
+          <w:p>
+            <w:r>
+              <w:t xml:space="preserve">5</w:t>
+            </w:r>
+          </w:p>
+        </w:tc>
+        <w:tc>
+          <w:tcPr>
+            <w:tcW w:type="dxa" w:w="1692"/>
+            <w:tcBorders>
+              <w:top w:val="single" w:color="B7C3D0" w:sz="4"/>
+              <w:left w:val="single" w:color="B7C3D0" w:sz="4"/>
+              <w:bottom w:val="single" w:color="B7C3D0" w:sz="4"/>
+              <w:right w:val="single" w:color="B7C3D0" w:sz="4"/>
+            </w:tcBorders>
+            <w:tcMar>
+              <w:top w:type="dxa" w:w="60"/>
+              <w:left w:type="dxa" w:w="100"/>
+              <w:bottom w:type="dxa" w:w="60"/>
+              <w:right w:type="dxa" w:w="100"/>
+            </w:tcMar>
+          </w:tcPr>
+          <w:p>
+            <w:r>
+              <w:t xml:space="preserve">Validate provider data</w:t>
+            </w:r>
+          </w:p>
+        </w:tc>
+        <w:tc>
+          <w:tcPr>
+            <w:tcW w:type="dxa" w:w="2256"/>
+            <w:tcBorders>
+              <w:top w:val="single" w:color="B7C3D0" w:sz="4"/>
+              <w:left w:val="single" w:color="B7C3D0" w:sz="4"/>
+              <w:bottom w:val="single" w:color="B7C3D0" w:sz="4"/>
+              <w:right w:val="single" w:color="B7C3D0" w:sz="4"/>
+            </w:tcBorders>
+            <w:tcMar>
+              <w:top w:type="dxa" w:w="60"/>
+              <w:left w:type="dxa" w:w="100"/>
+              <w:bottom w:type="dxa" w:w="60"/>
+              <w:right w:type="dxa" w:w="100"/>
+            </w:tcMar>
+          </w:tcPr>
+          <w:p>
+            <w:r>
+              <w:rPr>
+                <w:rFonts w:ascii="Consolas" w:cs="Consolas" w:eastAsia="Consolas" w:hAnsi="Consolas"/>
+                <w:color w:val="1F3A5F"/>
+                <w:sz w:val="19"/>
+                <w:szCs w:val="19"/>
+              </w:rPr>
+              <w:t xml:space="preserve">_validate_quote</w:t>
+            </w:r>
+            <w:r>
+              <w:t xml:space="preserve">, </w:t>
+            </w:r>
+            <w:r>
+              <w:rPr>
+                <w:rFonts w:ascii="Consolas" w:cs="Consolas" w:eastAsia="Consolas" w:hAnsi="Consolas"/>
+                <w:color w:val="1F3A5F"/>
+                <w:sz w:val="19"/>
+                <w:szCs w:val="19"/>
+              </w:rPr>
+              <w:t xml:space="preserve">_validate_bars</w:t>
+            </w:r>
+          </w:p>
+        </w:tc>
+        <w:tc>
+          <w:tcPr>
+            <w:tcW w:type="dxa" w:w="4514"/>
+            <w:tcBorders>
+              <w:top w:val="single" w:color="B7C3D0" w:sz="4"/>
+              <w:left w:val="single" w:color="B7C3D0" w:sz="4"/>
+              <w:bottom w:val="single" w:color="B7C3D0" w:sz="4"/>
+              <w:right w:val="single" w:color="B7C3D0" w:sz="4"/>
+            </w:tcBorders>
+            <w:tcMar>
+              <w:top w:type="dxa" w:w="60"/>
+              <w:left w:type="dxa" w:w="100"/>
+              <w:bottom w:type="dxa" w:w="60"/>
+              <w:right w:type="dxa" w:w="100"/>
+            </w:tcMar>
+          </w:tcPr>
+          <w:p>
+            <w:r>
+              <w:t xml:space="preserve">Currency and unit must match the instrument, prices within plausible bounds, no future timestamps; bars sorted, duplicates dropped, high ≥ low. Bad data fails the tool: nothing is invented.</w:t>
+            </w:r>
+          </w:p>
+        </w:tc>
+      </w:tr>
+      <w:tr>
+        <w:tc>
+          <w:tcPr>
+            <w:tcW w:type="dxa" w:w="564"/>
+            <w:tcBorders>
+              <w:top w:val="single" w:color="B7C3D0" w:sz="4"/>
+              <w:left w:val="single" w:color="B7C3D0" w:sz="4"/>
+              <w:bottom w:val="single" w:color="B7C3D0" w:sz="4"/>
+              <w:right w:val="single" w:color="B7C3D0" w:sz="4"/>
+            </w:tcBorders>
+            <w:tcMar>
+              <w:top w:type="dxa" w:w="60"/>
+              <w:left w:type="dxa" w:w="100"/>
+              <w:bottom w:type="dxa" w:w="60"/>
+              <w:right w:type="dxa" w:w="100"/>
+            </w:tcMar>
+          </w:tcPr>
+          <w:p>
+            <w:r>
+              <w:t xml:space="preserve">6</w:t>
+            </w:r>
+          </w:p>
+        </w:tc>
+        <w:tc>
+          <w:tcPr>
+            <w:tcW w:type="dxa" w:w="1692"/>
+            <w:tcBorders>
+              <w:top w:val="single" w:color="B7C3D0" w:sz="4"/>
+              <w:left w:val="single" w:color="B7C3D0" w:sz="4"/>
+              <w:bottom w:val="single" w:color="B7C3D0" w:sz="4"/>
+              <w:right w:val="single" w:color="B7C3D0" w:sz="4"/>
+            </w:tcBorders>
+            <w:tcMar>
+              <w:top w:type="dxa" w:w="60"/>
+              <w:left w:type="dxa" w:w="100"/>
+              <w:bottom w:type="dxa" w:w="60"/>
+              <w:right w:type="dxa" w:w="100"/>
+            </w:tcMar>
+          </w:tcPr>
+          <w:p>
+            <w:r>
+              <w:t xml:space="preserve">Compute indicators</w:t>
+            </w:r>
+          </w:p>
+        </w:tc>
+        <w:tc>
+          <w:tcPr>
+            <w:tcW w:type="dxa" w:w="2256"/>
+            <w:tcBorders>
+              <w:top w:val="single" w:color="B7C3D0" w:sz="4"/>
+              <w:left w:val="single" w:color="B7C3D0" w:sz="4"/>
+              <w:bottom w:val="single" w:color="B7C3D0" w:sz="4"/>
+              <w:right w:val="single" w:color="B7C3D0" w:sz="4"/>
+            </w:tcBorders>
+            <w:tcMar>
+              <w:top w:type="dxa" w:w="60"/>
+              <w:left w:type="dxa" w:w="100"/>
+              <w:bottom w:type="dxa" w:w="60"/>
+              <w:right w:type="dxa" w:w="100"/>
+            </w:tcMar>
+          </w:tcPr>
+          <w:p>
+            <w:r>
+              <w:rPr>
+                <w:rFonts w:ascii="Consolas" w:cs="Consolas" w:eastAsia="Consolas" w:hAnsi="Consolas"/>
+                <w:color w:val="1F3A5F"/>
+                <w:sz w:val="19"/>
+                <w:szCs w:val="19"/>
+              </w:rPr>
+              <w:t xml:space="preserve">compute_indicators</w:t>
+            </w:r>
+            <w:r>
+              <w:t xml:space="preserve">, </w:t>
+            </w:r>
+            <w:r>
+              <w:rPr>
+                <w:rFonts w:ascii="Consolas" w:cs="Consolas" w:eastAsia="Consolas" w:hAnsi="Consolas"/>
+                <w:color w:val="1F3A5F"/>
+                <w:sz w:val="19"/>
+                <w:szCs w:val="19"/>
+              </w:rPr>
+              <w:t xml:space="preserve">indicators/core.py</w:t>
+            </w:r>
+          </w:p>
+        </w:tc>
+        <w:tc>
+          <w:tcPr>
+            <w:tcW w:type="dxa" w:w="4514"/>
+            <w:tcBorders>
+              <w:top w:val="single" w:color="B7C3D0" w:sz="4"/>
+              <w:left w:val="single" w:color="B7C3D0" w:sz="4"/>
+              <w:bottom w:val="single" w:color="B7C3D0" w:sz="4"/>
+              <w:right w:val="single" w:color="B7C3D0" w:sz="4"/>
+            </w:tcBorders>
+            <w:tcMar>
+              <w:top w:type="dxa" w:w="60"/>
+              <w:left w:type="dxa" w:w="100"/>
+              <w:bottom w:type="dxa" w:w="60"/>
+              <w:right w:type="dxa" w:w="100"/>
+            </w:tcMar>
+          </w:tcPr>
+          <w:p>
+            <w:r>
+              <w:t xml:space="preserve">SMA, EMA, RSI, MACD, ATR and Bollinger bands from the validated bars, with a lookback set by </w:t>
+            </w:r>
+            <w:r>
+              <w:rPr>
+                <w:rFonts w:ascii="Consolas" w:cs="Consolas" w:eastAsia="Consolas" w:hAnsi="Consolas"/>
+                <w:color w:val="1F3A5F"/>
+                <w:sz w:val="19"/>
+                <w:szCs w:val="19"/>
+              </w:rPr>
+              <w:t xml:space="preserve">history_plan(horizon)</w:t>
+            </w:r>
+            <w:r>
+              <w:t xml:space="preserve">.</w:t>
+            </w:r>
+          </w:p>
+        </w:tc>
+      </w:tr>
+      <w:tr>
+        <w:tc>
+          <w:tcPr>
+            <w:tcW w:type="dxa" w:w="564"/>
+            <w:tcBorders>
+              <w:top w:val="single" w:color="B7C3D0" w:sz="4"/>
+              <w:left w:val="single" w:color="B7C3D0" w:sz="4"/>
+              <w:bottom w:val="single" w:color="B7C3D0" w:sz="4"/>
+              <w:right w:val="single" w:color="B7C3D0" w:sz="4"/>
+            </w:tcBorders>
+            <w:tcMar>
+              <w:top w:type="dxa" w:w="60"/>
+              <w:left w:type="dxa" w:w="100"/>
+              <w:bottom w:type="dxa" w:w="60"/>
+              <w:right w:type="dxa" w:w="100"/>
+            </w:tcMar>
+          </w:tcPr>
+          <w:p>
+            <w:r>
+              <w:t xml:space="preserve">7</w:t>
+            </w:r>
+          </w:p>
+        </w:tc>
+        <w:tc>
+          <w:tcPr>
+            <w:tcW w:type="dxa" w:w="1692"/>
+            <w:tcBorders>
+              <w:top w:val="single" w:color="B7C3D0" w:sz="4"/>
+              <w:left w:val="single" w:color="B7C3D0" w:sz="4"/>
+              <w:bottom w:val="single" w:color="B7C3D0" w:sz="4"/>
+              <w:right w:val="single" w:color="B7C3D0" w:sz="4"/>
+            </w:tcBorders>
+            <w:tcMar>
+              <w:top w:type="dxa" w:w="60"/>
+              <w:left w:type="dxa" w:w="100"/>
+              <w:bottom w:type="dxa" w:w="60"/>
+              <w:right w:type="dxa" w:w="100"/>
+            </w:tcMar>
+          </w:tcPr>
+          <w:p>
+            <w:r>
+              <w:t xml:space="preserve">Build the news query</w:t>
+            </w:r>
+          </w:p>
+        </w:tc>
+        <w:tc>
+          <w:tcPr>
+            <w:tcW w:type="dxa" w:w="2256"/>
+            <w:tcBorders>
+              <w:top w:val="single" w:color="B7C3D0" w:sz="4"/>
+              <w:left w:val="single" w:color="B7C3D0" w:sz="4"/>
+              <w:bottom w:val="single" w:color="B7C3D0" w:sz="4"/>
+              <w:right w:val="single" w:color="B7C3D0" w:sz="4"/>
+            </w:tcBorders>
+            <w:tcMar>
+              <w:top w:type="dxa" w:w="60"/>
+              <w:left w:type="dxa" w:w="100"/>
+              <w:bottom w:type="dxa" w:w="60"/>
+              <w:right w:type="dxa" w:w="100"/>
+            </w:tcMar>
+          </w:tcPr>
+          <w:p>
+            <w:r>
+              <w:rPr>
+                <w:rFonts w:ascii="Consolas" w:cs="Consolas" w:eastAsia="Consolas" w:hAnsi="Consolas"/>
+                <w:color w:val="1F3A5F"/>
+                <w:sz w:val="19"/>
+                <w:szCs w:val="19"/>
+              </w:rPr>
+              <w:t xml:space="preserve">ToolService.search_news</w:t>
+            </w:r>
+          </w:p>
+        </w:tc>
+        <w:tc>
+          <w:tcPr>
+            <w:tcW w:type="dxa" w:w="4514"/>
+            <w:tcBorders>
+              <w:top w:val="single" w:color="B7C3D0" w:sz="4"/>
+              <w:left w:val="single" w:color="B7C3D0" w:sz="4"/>
+              <w:bottom w:val="single" w:color="B7C3D0" w:sz="4"/>
+              <w:right w:val="single" w:color="B7C3D0" w:sz="4"/>
+            </w:tcBorders>
+            <w:tcMar>
+              <w:top w:type="dxa" w:w="60"/>
+              <w:left w:type="dxa" w:w="100"/>
+              <w:bottom w:type="dxa" w:w="60"/>
+              <w:right w:type="dxa" w:w="100"/>
+            </w:tcMar>
+          </w:tcPr>
+          <w:p>
+            <w:r>
+              <w:t xml:space="preserve">Server-built query ("&lt;metal&gt; price market outlook" plus up to 80 chars of focus words), recency window by horizon, at most 8 articles.</w:t>
+            </w:r>
+          </w:p>
+        </w:tc>
+      </w:tr>
+      <w:tr>
+        <w:tc>
+          <w:tcPr>
+            <w:tcW w:type="dxa" w:w="564"/>
+            <w:tcBorders>
+              <w:top w:val="single" w:color="B7C3D0" w:sz="4"/>
+              <w:left w:val="single" w:color="B7C3D0" w:sz="4"/>
+              <w:bottom w:val="single" w:color="B7C3D0" w:sz="4"/>
+              <w:right w:val="single" w:color="B7C3D0" w:sz="4"/>
+            </w:tcBorders>
+            <w:tcMar>
+              <w:top w:type="dxa" w:w="60"/>
+              <w:left w:type="dxa" w:w="100"/>
+              <w:bottom w:type="dxa" w:w="60"/>
+              <w:right w:type="dxa" w:w="100"/>
+            </w:tcMar>
+          </w:tcPr>
+          <w:p>
+            <w:r>
+              <w:t xml:space="preserve">8</w:t>
+            </w:r>
+          </w:p>
+        </w:tc>
+        <w:tc>
+          <w:tcPr>
+            <w:tcW w:type="dxa" w:w="1692"/>
+            <w:tcBorders>
+              <w:top w:val="single" w:color="B7C3D0" w:sz="4"/>
+              <w:left w:val="single" w:color="B7C3D0" w:sz="4"/>
+              <w:bottom w:val="single" w:color="B7C3D0" w:sz="4"/>
+              <w:right w:val="single" w:color="B7C3D0" w:sz="4"/>
+            </w:tcBorders>
+            <w:tcMar>
+              <w:top w:type="dxa" w:w="60"/>
+              <w:left w:type="dxa" w:w="100"/>
+              <w:bottom w:type="dxa" w:w="60"/>
+              <w:right w:type="dxa" w:w="100"/>
+            </w:tcMar>
+          </w:tcPr>
+          <w:p>
+            <w:r>
+              <w:t xml:space="preserve">Envelope and provenance</w:t>
+            </w:r>
+          </w:p>
+        </w:tc>
+        <w:tc>
+          <w:tcPr>
+            <w:tcW w:type="dxa" w:w="2256"/>
+            <w:tcBorders>
+              <w:top w:val="single" w:color="B7C3D0" w:sz="4"/>
+              <w:left w:val="single" w:color="B7C3D0" w:sz="4"/>
+              <w:bottom w:val="single" w:color="B7C3D0" w:sz="4"/>
+              <w:right w:val="single" w:color="B7C3D0" w:sz="4"/>
+            </w:tcBorders>
+            <w:tcMar>
+              <w:top w:type="dxa" w:w="60"/>
+              <w:left w:type="dxa" w:w="100"/>
+              <w:bottom w:type="dxa" w:w="60"/>
+              <w:right w:type="dxa" w:w="100"/>
+            </w:tcMar>
+          </w:tcPr>
+          <w:p>
+            <w:r>
+              <w:rPr>
+                <w:rFonts w:ascii="Consolas" w:cs="Consolas" w:eastAsia="Consolas" w:hAnsi="Consolas"/>
+                <w:color w:val="1F3A5F"/>
+                <w:sz w:val="19"/>
+                <w:szCs w:val="19"/>
+              </w:rPr>
+              <w:t xml:space="preserve">ToolEnvelope</w:t>
+            </w:r>
+            <w:r>
+              <w:t xml:space="preserve">, </w:t>
+            </w:r>
+            <w:r>
+              <w:rPr>
+                <w:rFonts w:ascii="Consolas" w:cs="Consolas" w:eastAsia="Consolas" w:hAnsi="Consolas"/>
+                <w:color w:val="1F3A5F"/>
+                <w:sz w:val="19"/>
+                <w:szCs w:val="19"/>
+              </w:rPr>
+              <w:t xml:space="preserve">validate_envelope</w:t>
+            </w:r>
+          </w:p>
+        </w:tc>
+        <w:tc>
+          <w:tcPr>
+            <w:tcW w:type="dxa" w:w="4514"/>
+            <w:tcBorders>
+              <w:top w:val="single" w:color="B7C3D0" w:sz="4"/>
+              <w:left w:val="single" w:color="B7C3D0" w:sz="4"/>
+              <w:bottom w:val="single" w:color="B7C3D0" w:sz="4"/>
+              <w:right w:val="single" w:color="B7C3D0" w:sz="4"/>
+            </w:tcBorders>
+            <w:tcMar>
+              <w:top w:type="dxa" w:w="60"/>
+              <w:left w:type="dxa" w:w="100"/>
+              <w:bottom w:type="dxa" w:w="60"/>
+              <w:right w:type="dxa" w:w="100"/>
+            </w:tcMar>
+          </w:tcPr>
+          <w:p>
+            <w:r>
+              <w:t xml:space="preserve">Wraps each result with source, as-of time and a provenance hash; malformed envelopes are rejected.</w:t>
+            </w:r>
+          </w:p>
+        </w:tc>
+      </w:tr>
+      <w:tr>
+        <w:tc>
+          <w:tcPr>
+            <w:tcW w:type="dxa" w:w="564"/>
+            <w:tcBorders>
+              <w:top w:val="single" w:color="B7C3D0" w:sz="4"/>
+              <w:left w:val="single" w:color="B7C3D0" w:sz="4"/>
+              <w:bottom w:val="single" w:color="B7C3D0" w:sz="4"/>
+              <w:right w:val="single" w:color="B7C3D0" w:sz="4"/>
+            </w:tcBorders>
+            <w:tcMar>
+              <w:top w:type="dxa" w:w="60"/>
+              <w:left w:type="dxa" w:w="100"/>
+              <w:bottom w:type="dxa" w:w="60"/>
+              <w:right w:type="dxa" w:w="100"/>
+            </w:tcMar>
+          </w:tcPr>
+          <w:p>
+            <w:r>
+              <w:t xml:space="preserve">9</w:t>
+            </w:r>
+          </w:p>
+        </w:tc>
+        <w:tc>
+          <w:tcPr>
+            <w:tcW w:type="dxa" w:w="1692"/>
+            <w:tcBorders>
+              <w:top w:val="single" w:color="B7C3D0" w:sz="4"/>
+              <w:left w:val="single" w:color="B7C3D0" w:sz="4"/>
+              <w:bottom w:val="single" w:color="B7C3D0" w:sz="4"/>
+              <w:right w:val="single" w:color="B7C3D0" w:sz="4"/>
+            </w:tcBorders>
+            <w:tcMar>
+              <w:top w:type="dxa" w:w="60"/>
+              <w:left w:type="dxa" w:w="100"/>
+              <w:bottom w:type="dxa" w:w="60"/>
+              <w:right w:type="dxa" w:w="100"/>
+            </w:tcMar>
+          </w:tcPr>
+          <w:p>
+            <w:r>
+              <w:t xml:space="preserve">Normalise to evidence</w:t>
+            </w:r>
+          </w:p>
+        </w:tc>
+        <w:tc>
+          <w:tcPr>
+            <w:tcW w:type="dxa" w:w="2256"/>
+            <w:tcBorders>
+              <w:top w:val="single" w:color="B7C3D0" w:sz="4"/>
+              <w:left w:val="single" w:color="B7C3D0" w:sz="4"/>
+              <w:bottom w:val="single" w:color="B7C3D0" w:sz="4"/>
+              <w:right w:val="single" w:color="B7C3D0" w:sz="4"/>
+            </w:tcBorders>
+            <w:tcMar>
+              <w:top w:type="dxa" w:w="60"/>
+              <w:left w:type="dxa" w:w="100"/>
+              <w:bottom w:type="dxa" w:w="60"/>
+              <w:right w:type="dxa" w:w="100"/>
+            </w:tcMar>
+          </w:tcPr>
+          <w:p>
+            <w:r>
+              <w:rPr>
+                <w:rFonts w:ascii="Consolas" w:cs="Consolas" w:eastAsia="Consolas" w:hAnsi="Consolas"/>
+                <w:color w:val="1F3A5F"/>
+                <w:sz w:val="19"/>
+                <w:szCs w:val="19"/>
+              </w:rPr>
+              <w:t xml:space="preserve">normalise</w:t>
+            </w:r>
+            <w:r>
+              <w:t xml:space="preserve"> (</w:t>
+            </w:r>
+            <w:r>
+              <w:rPr>
+                <w:rFonts w:ascii="Consolas" w:cs="Consolas" w:eastAsia="Consolas" w:hAnsi="Consolas"/>
+                <w:color w:val="1F3A5F"/>
+                <w:sz w:val="19"/>
+                <w:szCs w:val="19"/>
+              </w:rPr>
+              <w:t xml:space="preserve">workflows/evidence.py</w:t>
+            </w:r>
+            <w:r>
+              <w:t xml:space="preserve">)</w:t>
+            </w:r>
+          </w:p>
+        </w:tc>
+        <w:tc>
+          <w:tcPr>
+            <w:tcW w:type="dxa" w:w="4514"/>
+            <w:tcBorders>
+              <w:top w:val="single" w:color="B7C3D0" w:sz="4"/>
+              <w:left w:val="single" w:color="B7C3D0" w:sz="4"/>
+              <w:bottom w:val="single" w:color="B7C3D0" w:sz="4"/>
+              <w:right w:val="single" w:color="B7C3D0" w:sz="4"/>
+            </w:tcBorders>
+            <w:tcMar>
+              <w:top w:type="dxa" w:w="60"/>
+              <w:left w:type="dxa" w:w="100"/>
+              <w:bottom w:type="dxa" w:w="60"/>
+              <w:right w:type="dxa" w:w="100"/>
+            </w:tcMar>
+          </w:tcPr>
+          <w:p>
+            <w:r>
+              <w:t xml:space="preserve">Turns envelopes into </w:t>
+            </w:r>
+            <w:r>
+              <w:rPr>
+                <w:rFonts w:ascii="Consolas" w:cs="Consolas" w:eastAsia="Consolas" w:hAnsi="Consolas"/>
+                <w:color w:val="1F3A5F"/>
+                <w:sz w:val="19"/>
+                <w:szCs w:val="19"/>
+              </w:rPr>
+              <w:t xml:space="preserve">EvidenceItem</w:t>
+            </w:r>
+            <w:r>
+              <w:t xml:space="preserve">s with server-assigned IDs, units and currencies.</w:t>
+            </w:r>
+          </w:p>
+        </w:tc>
+      </w:tr>
+      <w:tr>
+        <w:tc>
+          <w:tcPr>
+            <w:tcW w:type="dxa" w:w="564"/>
+            <w:tcBorders>
+              <w:top w:val="single" w:color="B7C3D0" w:sz="4"/>
+              <w:left w:val="single" w:color="B7C3D0" w:sz="4"/>
+              <w:bottom w:val="single" w:color="B7C3D0" w:sz="4"/>
+              <w:right w:val="single" w:color="B7C3D0" w:sz="4"/>
+            </w:tcBorders>
+            <w:tcMar>
+              <w:top w:type="dxa" w:w="60"/>
+              <w:left w:type="dxa" w:w="100"/>
+              <w:bottom w:type="dxa" w:w="60"/>
+              <w:right w:type="dxa" w:w="100"/>
+            </w:tcMar>
+          </w:tcPr>
+          <w:p>
+            <w:r>
+              <w:t xml:space="preserve">10</w:t>
+            </w:r>
+          </w:p>
+        </w:tc>
+        <w:tc>
+          <w:tcPr>
+            <w:tcW w:type="dxa" w:w="1692"/>
+            <w:tcBorders>
+              <w:top w:val="single" w:color="B7C3D0" w:sz="4"/>
+              <w:left w:val="single" w:color="B7C3D0" w:sz="4"/>
+              <w:bottom w:val="single" w:color="B7C3D0" w:sz="4"/>
+              <w:right w:val="single" w:color="B7C3D0" w:sz="4"/>
+            </w:tcBorders>
+            <w:tcMar>
+              <w:top w:type="dxa" w:w="60"/>
+              <w:left w:type="dxa" w:w="100"/>
+              <w:bottom w:type="dxa" w:w="60"/>
+              <w:right w:type="dxa" w:w="100"/>
+            </w:tcMar>
+          </w:tcPr>
+          <w:p>
+            <w:r>
+              <w:t xml:space="preserve">Scan for injection</w:t>
+            </w:r>
+          </w:p>
+        </w:tc>
+        <w:tc>
+          <w:tcPr>
+            <w:tcW w:type="dxa" w:w="2256"/>
+            <w:tcBorders>
+              <w:top w:val="single" w:color="B7C3D0" w:sz="4"/>
+              <w:left w:val="single" w:color="B7C3D0" w:sz="4"/>
+              <w:bottom w:val="single" w:color="B7C3D0" w:sz="4"/>
+              <w:right w:val="single" w:color="B7C3D0" w:sz="4"/>
+            </w:tcBorders>
+            <w:tcMar>
+              <w:top w:type="dxa" w:w="60"/>
+              <w:left w:type="dxa" w:w="100"/>
+              <w:bottom w:type="dxa" w:w="60"/>
+              <w:right w:type="dxa" w:w="100"/>
+            </w:tcMar>
+          </w:tcPr>
+          <w:p>
+            <w:r>
+              <w:rPr>
+                <w:rFonts w:ascii="Consolas" w:cs="Consolas" w:eastAsia="Consolas" w:hAnsi="Consolas"/>
+                <w:color w:val="1F3A5F"/>
+                <w:sz w:val="19"/>
+                <w:szCs w:val="19"/>
+              </w:rPr>
+              <w:t xml:space="preserve">security/injection.py</w:t>
+            </w:r>
+            <w:r>
+              <w:t xml:space="preserve"> </w:t>
+            </w:r>
+            <w:r>
+              <w:rPr>
+                <w:rFonts w:ascii="Consolas" w:cs="Consolas" w:eastAsia="Consolas" w:hAnsi="Consolas"/>
+                <w:color w:val="1F3A5F"/>
+                <w:sz w:val="19"/>
+                <w:szCs w:val="19"/>
+              </w:rPr>
+              <w:t xml:space="preserve">scan</w:t>
+            </w:r>
+          </w:p>
+        </w:tc>
+        <w:tc>
+          <w:tcPr>
+            <w:tcW w:type="dxa" w:w="4514"/>
+            <w:tcBorders>
+              <w:top w:val="single" w:color="B7C3D0" w:sz="4"/>
+              <w:left w:val="single" w:color="B7C3D0" w:sz="4"/>
+              <w:bottom w:val="single" w:color="B7C3D0" w:sz="4"/>
+              <w:right w:val="single" w:color="B7C3D0" w:sz="4"/>
+            </w:tcBorders>
+            <w:tcMar>
+              <w:top w:type="dxa" w:w="60"/>
+              <w:left w:type="dxa" w:w="100"/>
+              <w:bottom w:type="dxa" w:w="60"/>
+              <w:right w:type="dxa" w:w="100"/>
+            </w:tcMar>
+          </w:tcPr>
+          <w:p>
+            <w:r>
+              <w:t xml:space="preserve">Flags instruction-like text in news; quarantined items are replaced by a </w:t>
+            </w:r>
+            <w:r>
+              <w:rPr>
+                <w:rFonts w:ascii="Consolas" w:cs="Consolas" w:eastAsia="Consolas" w:hAnsi="Consolas"/>
+                <w:color w:val="1F3A5F"/>
+                <w:sz w:val="19"/>
+                <w:szCs w:val="19"/>
+              </w:rPr>
+              <w:t xml:space="preserve">redacted</w:t>
+            </w:r>
+            <w:r>
+              <w:t xml:space="preserve"> record and logged.</w:t>
+            </w:r>
+          </w:p>
+        </w:tc>
+      </w:tr>
+      <w:tr>
+        <w:tc>
+          <w:tcPr>
+            <w:tcW w:type="dxa" w:w="564"/>
+            <w:tcBorders>
+              <w:top w:val="single" w:color="B7C3D0" w:sz="4"/>
+              <w:left w:val="single" w:color="B7C3D0" w:sz="4"/>
+              <w:bottom w:val="single" w:color="B7C3D0" w:sz="4"/>
+              <w:right w:val="single" w:color="B7C3D0" w:sz="4"/>
+            </w:tcBorders>
+            <w:tcMar>
+              <w:top w:type="dxa" w:w="60"/>
+              <w:left w:type="dxa" w:w="100"/>
+              <w:bottom w:type="dxa" w:w="60"/>
+              <w:right w:type="dxa" w:w="100"/>
+            </w:tcMar>
+          </w:tcPr>
+          <w:p>
+            <w:r>
+              <w:t xml:space="preserve">11</w:t>
+            </w:r>
+          </w:p>
+        </w:tc>
+        <w:tc>
+          <w:tcPr>
+            <w:tcW w:type="dxa" w:w="1692"/>
+            <w:tcBorders>
+              <w:top w:val="single" w:color="B7C3D0" w:sz="4"/>
+              <w:left w:val="single" w:color="B7C3D0" w:sz="4"/>
+              <w:bottom w:val="single" w:color="B7C3D0" w:sz="4"/>
+              <w:right w:val="single" w:color="B7C3D0" w:sz="4"/>
+            </w:tcBorders>
+            <w:tcMar>
+              <w:top w:type="dxa" w:w="60"/>
+              <w:left w:type="dxa" w:w="100"/>
+              <w:bottom w:type="dxa" w:w="60"/>
+              <w:right w:type="dxa" w:w="100"/>
+            </w:tcMar>
+          </w:tcPr>
+          <w:p>
+            <w:r>
+              <w:t xml:space="preserve">Prepare the model view</w:t>
+            </w:r>
+          </w:p>
+        </w:tc>
+        <w:tc>
+          <w:tcPr>
+            <w:tcW w:type="dxa" w:w="2256"/>
+            <w:tcBorders>
+              <w:top w:val="single" w:color="B7C3D0" w:sz="4"/>
+              <w:left w:val="single" w:color="B7C3D0" w:sz="4"/>
+              <w:bottom w:val="single" w:color="B7C3D0" w:sz="4"/>
+              <w:right w:val="single" w:color="B7C3D0" w:sz="4"/>
+            </w:tcBorders>
+            <w:tcMar>
+              <w:top w:type="dxa" w:w="60"/>
+              <w:left w:type="dxa" w:w="100"/>
+              <w:bottom w:type="dxa" w:w="60"/>
+              <w:right w:type="dxa" w:w="100"/>
+            </w:tcMar>
+          </w:tcPr>
+          <w:p>
+            <w:r>
+              <w:rPr>
+                <w:rFonts w:ascii="Consolas" w:cs="Consolas" w:eastAsia="Consolas" w:hAnsi="Consolas"/>
+                <w:color w:val="1F3A5F"/>
+                <w:sz w:val="19"/>
+                <w:szCs w:val="19"/>
+              </w:rPr>
+              <w:t xml:space="preserve">model_view</w:t>
+            </w:r>
+            <w:r>
+              <w:t xml:space="preserve">, </w:t>
+            </w:r>
+            <w:r>
+              <w:rPr>
+                <w:rFonts w:ascii="Consolas" w:cs="Consolas" w:eastAsia="Consolas" w:hAnsi="Consolas"/>
+                <w:color w:val="1F3A5F"/>
+                <w:sz w:val="19"/>
+                <w:szCs w:val="19"/>
+              </w:rPr>
+              <w:t xml:space="preserve">bundle_text</w:t>
+            </w:r>
+          </w:p>
+        </w:tc>
+        <w:tc>
+          <w:tcPr>
+            <w:tcW w:type="dxa" w:w="4514"/>
+            <w:tcBorders>
+              <w:top w:val="single" w:color="B7C3D0" w:sz="4"/>
+              <w:left w:val="single" w:color="B7C3D0" w:sz="4"/>
+              <w:bottom w:val="single" w:color="B7C3D0" w:sz="4"/>
+              <w:right w:val="single" w:color="B7C3D0" w:sz="4"/>
+            </w:tcBorders>
+            <w:tcMar>
+              <w:top w:type="dxa" w:w="60"/>
+              <w:left w:type="dxa" w:w="100"/>
+              <w:bottom w:type="dxa" w:w="60"/>
+              <w:right w:type="dxa" w:w="100"/>
+            </w:tcMar>
+          </w:tcPr>
+          <w:p>
+            <w:r>
+              <w:t xml:space="preserve">External text is wrapped and marked as data, not instructions; the Signal agent gets only the validated bundle.</w:t>
             </w:r>
           </w:p>
         </w:tc>

</xml_diff>

<commit_message>
Docs: one-time setup steps in the workflows document appendix
Co-Authored-By: Claude Opus 5.5 <noreply@anthropic.com>
</commit_message>
<xml_diff>
--- a/docs/Agentic AI SaaS - Workflows etc.docx
+++ b/docs/Agentic AI SaaS - Workflows etc.docx
@@ -21144,7 +21144,15 @@
         <w:pageBreakBefore/>
       </w:pPr>
       <w:r>
-        <w:t xml:space="preserve">12. Appendix: frontend map</w:t>
+        <w:t xml:space="preserve">12. Appendix</w:t>
+      </w:r>
+    </w:p>
+    <w:p>
+      <w:pPr>
+        <w:pStyle w:val="Heading2"/>
+      </w:pPr>
+      <w:r>
+        <w:t xml:space="preserve">Frontend map</w:t>
       </w:r>
     </w:p>
     <w:tbl>
@@ -21829,6 +21837,1228 @@
           <w:szCs w:val="19"/>
         </w:rPr>
         <w:t xml:space="preserve">docs/traceability.csv</w:t>
+      </w:r>
+      <w:r>
+        <w:t xml:space="preserve">.</w:t>
+      </w:r>
+    </w:p>
+    <w:p>
+      <w:pPr>
+        <w:pStyle w:val="Heading2"/>
+      </w:pPr>
+      <w:r>
+        <w:t xml:space="preserve">One-time setup before the first research run</w:t>
+      </w:r>
+    </w:p>
+    <w:tbl>
+      <w:tblPr>
+        <w:tblW w:type="dxa" w:w="9026"/>
+        <w:tblBorders>
+          <w:top w:val="single" w:color="auto" w:sz="4"/>
+          <w:left w:val="single" w:color="auto" w:sz="4"/>
+          <w:bottom w:val="single" w:color="auto" w:sz="4"/>
+          <w:right w:val="single" w:color="auto" w:sz="4"/>
+          <w:insideH w:val="single" w:color="auto" w:sz="4"/>
+          <w:insideV w:val="single" w:color="auto" w:sz="4"/>
+        </w:tblBorders>
+      </w:tblPr>
+      <w:tblGrid>
+        <w:gridCol w:w="564"/>
+        <w:gridCol w:w="1692"/>
+        <w:gridCol w:w="2820"/>
+        <w:gridCol w:w="3950"/>
+      </w:tblGrid>
+      <w:tr>
+        <w:trPr>
+          <w:tblHeader/>
+        </w:trPr>
+        <w:tc>
+          <w:tcPr>
+            <w:tcW w:type="dxa" w:w="564"/>
+            <w:tcBorders>
+              <w:top w:val="single" w:color="B7C3D0" w:sz="4"/>
+              <w:left w:val="single" w:color="B7C3D0" w:sz="4"/>
+              <w:bottom w:val="single" w:color="B7C3D0" w:sz="4"/>
+              <w:right w:val="single" w:color="B7C3D0" w:sz="4"/>
+            </w:tcBorders>
+            <w:shd w:fill="1F3A5F" w:color="auto" w:val="clear"/>
+            <w:tcMar>
+              <w:top w:type="dxa" w:w="60"/>
+              <w:left w:type="dxa" w:w="100"/>
+              <w:bottom w:type="dxa" w:w="60"/>
+              <w:right w:type="dxa" w:w="100"/>
+            </w:tcMar>
+          </w:tcPr>
+          <w:p>
+            <w:r>
+              <w:rPr>
+                <w:b/>
+                <w:bCs/>
+                <w:color w:val="FFFFFF"/>
+              </w:rPr>
+              <w:t xml:space="preserve">#</w:t>
+            </w:r>
+          </w:p>
+        </w:tc>
+        <w:tc>
+          <w:tcPr>
+            <w:tcW w:type="dxa" w:w="1692"/>
+            <w:tcBorders>
+              <w:top w:val="single" w:color="B7C3D0" w:sz="4"/>
+              <w:left w:val="single" w:color="B7C3D0" w:sz="4"/>
+              <w:bottom w:val="single" w:color="B7C3D0" w:sz="4"/>
+              <w:right w:val="single" w:color="B7C3D0" w:sz="4"/>
+            </w:tcBorders>
+            <w:shd w:fill="1F3A5F" w:color="auto" w:val="clear"/>
+            <w:tcMar>
+              <w:top w:type="dxa" w:w="60"/>
+              <w:left w:type="dxa" w:w="100"/>
+              <w:bottom w:type="dxa" w:w="60"/>
+              <w:right w:type="dxa" w:w="100"/>
+            </w:tcMar>
+          </w:tcPr>
+          <w:p>
+            <w:r>
+              <w:rPr>
+                <w:b/>
+                <w:bCs/>
+                <w:color w:val="FFFFFF"/>
+              </w:rPr>
+              <w:t xml:space="preserve">Step</w:t>
+            </w:r>
+          </w:p>
+        </w:tc>
+        <w:tc>
+          <w:tcPr>
+            <w:tcW w:type="dxa" w:w="2820"/>
+            <w:tcBorders>
+              <w:top w:val="single" w:color="B7C3D0" w:sz="4"/>
+              <w:left w:val="single" w:color="B7C3D0" w:sz="4"/>
+              <w:bottom w:val="single" w:color="B7C3D0" w:sz="4"/>
+              <w:right w:val="single" w:color="B7C3D0" w:sz="4"/>
+            </w:tcBorders>
+            <w:shd w:fill="1F3A5F" w:color="auto" w:val="clear"/>
+            <w:tcMar>
+              <w:top w:type="dxa" w:w="60"/>
+              <w:left w:type="dxa" w:w="100"/>
+              <w:bottom w:type="dxa" w:w="60"/>
+              <w:right w:type="dxa" w:w="100"/>
+            </w:tcMar>
+          </w:tcPr>
+          <w:p>
+            <w:r>
+              <w:rPr>
+                <w:b/>
+                <w:bCs/>
+                <w:color w:val="FFFFFF"/>
+              </w:rPr>
+              <w:t xml:space="preserve">Command or file</w:t>
+            </w:r>
+          </w:p>
+        </w:tc>
+        <w:tc>
+          <w:tcPr>
+            <w:tcW w:type="dxa" w:w="3950"/>
+            <w:tcBorders>
+              <w:top w:val="single" w:color="B7C3D0" w:sz="4"/>
+              <w:left w:val="single" w:color="B7C3D0" w:sz="4"/>
+              <w:bottom w:val="single" w:color="B7C3D0" w:sz="4"/>
+              <w:right w:val="single" w:color="B7C3D0" w:sz="4"/>
+            </w:tcBorders>
+            <w:shd w:fill="1F3A5F" w:color="auto" w:val="clear"/>
+            <w:tcMar>
+              <w:top w:type="dxa" w:w="60"/>
+              <w:left w:type="dxa" w:w="100"/>
+              <w:bottom w:type="dxa" w:w="60"/>
+              <w:right w:type="dxa" w:w="100"/>
+            </w:tcMar>
+          </w:tcPr>
+          <w:p>
+            <w:r>
+              <w:rPr>
+                <w:b/>
+                <w:bCs/>
+                <w:color w:val="FFFFFF"/>
+              </w:rPr>
+              <w:t xml:space="preserve">Notes</w:t>
+            </w:r>
+          </w:p>
+        </w:tc>
+      </w:tr>
+      <w:tr>
+        <w:tc>
+          <w:tcPr>
+            <w:tcW w:type="dxa" w:w="564"/>
+            <w:tcBorders>
+              <w:top w:val="single" w:color="B7C3D0" w:sz="4"/>
+              <w:left w:val="single" w:color="B7C3D0" w:sz="4"/>
+              <w:bottom w:val="single" w:color="B7C3D0" w:sz="4"/>
+              <w:right w:val="single" w:color="B7C3D0" w:sz="4"/>
+            </w:tcBorders>
+            <w:tcMar>
+              <w:top w:type="dxa" w:w="60"/>
+              <w:left w:type="dxa" w:w="100"/>
+              <w:bottom w:type="dxa" w:w="60"/>
+              <w:right w:type="dxa" w:w="100"/>
+            </w:tcMar>
+          </w:tcPr>
+          <w:p>
+            <w:r>
+              <w:t xml:space="preserve">1</w:t>
+            </w:r>
+          </w:p>
+        </w:tc>
+        <w:tc>
+          <w:tcPr>
+            <w:tcW w:type="dxa" w:w="1692"/>
+            <w:tcBorders>
+              <w:top w:val="single" w:color="B7C3D0" w:sz="4"/>
+              <w:left w:val="single" w:color="B7C3D0" w:sz="4"/>
+              <w:bottom w:val="single" w:color="B7C3D0" w:sz="4"/>
+              <w:right w:val="single" w:color="B7C3D0" w:sz="4"/>
+            </w:tcBorders>
+            <w:tcMar>
+              <w:top w:type="dxa" w:w="60"/>
+              <w:left w:type="dxa" w:w="100"/>
+              <w:bottom w:type="dxa" w:w="60"/>
+              <w:right w:type="dxa" w:w="100"/>
+            </w:tcMar>
+          </w:tcPr>
+          <w:p>
+            <w:r>
+              <w:t xml:space="preserve">Install prerequisites</w:t>
+            </w:r>
+          </w:p>
+        </w:tc>
+        <w:tc>
+          <w:tcPr>
+            <w:tcW w:type="dxa" w:w="2820"/>
+            <w:tcBorders>
+              <w:top w:val="single" w:color="B7C3D0" w:sz="4"/>
+              <w:left w:val="single" w:color="B7C3D0" w:sz="4"/>
+              <w:bottom w:val="single" w:color="B7C3D0" w:sz="4"/>
+              <w:right w:val="single" w:color="B7C3D0" w:sz="4"/>
+            </w:tcBorders>
+            <w:tcMar>
+              <w:top w:type="dxa" w:w="60"/>
+              <w:left w:type="dxa" w:w="100"/>
+              <w:bottom w:type="dxa" w:w="60"/>
+              <w:right w:type="dxa" w:w="100"/>
+            </w:tcMar>
+          </w:tcPr>
+          <w:p>
+            <w:r>
+              <w:t xml:space="preserve">Docker Desktop (WSL 2), Git, Node.js 24 + pnpm, uv</w:t>
+            </w:r>
+          </w:p>
+        </w:tc>
+        <w:tc>
+          <w:tcPr>
+            <w:tcW w:type="dxa" w:w="3950"/>
+            <w:tcBorders>
+              <w:top w:val="single" w:color="B7C3D0" w:sz="4"/>
+              <w:left w:val="single" w:color="B7C3D0" w:sz="4"/>
+              <w:bottom w:val="single" w:color="B7C3D0" w:sz="4"/>
+              <w:right w:val="single" w:color="B7C3D0" w:sz="4"/>
+            </w:tcBorders>
+            <w:tcMar>
+              <w:top w:type="dxa" w:w="60"/>
+              <w:left w:type="dxa" w:w="100"/>
+              <w:bottom w:type="dxa" w:w="60"/>
+              <w:right w:type="dxa" w:w="100"/>
+            </w:tcMar>
+          </w:tcPr>
+          <w:p>
+            <w:r>
+              <w:t xml:space="preserve">uv manages Python 3.12.</w:t>
+            </w:r>
+          </w:p>
+        </w:tc>
+      </w:tr>
+      <w:tr>
+        <w:tc>
+          <w:tcPr>
+            <w:tcW w:type="dxa" w:w="564"/>
+            <w:tcBorders>
+              <w:top w:val="single" w:color="B7C3D0" w:sz="4"/>
+              <w:left w:val="single" w:color="B7C3D0" w:sz="4"/>
+              <w:bottom w:val="single" w:color="B7C3D0" w:sz="4"/>
+              <w:right w:val="single" w:color="B7C3D0" w:sz="4"/>
+            </w:tcBorders>
+            <w:tcMar>
+              <w:top w:type="dxa" w:w="60"/>
+              <w:left w:type="dxa" w:w="100"/>
+              <w:bottom w:type="dxa" w:w="60"/>
+              <w:right w:type="dxa" w:w="100"/>
+            </w:tcMar>
+          </w:tcPr>
+          <w:p>
+            <w:r>
+              <w:t xml:space="preserve">2</w:t>
+            </w:r>
+          </w:p>
+        </w:tc>
+        <w:tc>
+          <w:tcPr>
+            <w:tcW w:type="dxa" w:w="1692"/>
+            <w:tcBorders>
+              <w:top w:val="single" w:color="B7C3D0" w:sz="4"/>
+              <w:left w:val="single" w:color="B7C3D0" w:sz="4"/>
+              <w:bottom w:val="single" w:color="B7C3D0" w:sz="4"/>
+              <w:right w:val="single" w:color="B7C3D0" w:sz="4"/>
+            </w:tcBorders>
+            <w:tcMar>
+              <w:top w:type="dxa" w:w="60"/>
+              <w:left w:type="dxa" w:w="100"/>
+              <w:bottom w:type="dxa" w:w="60"/>
+              <w:right w:type="dxa" w:w="100"/>
+            </w:tcMar>
+          </w:tcPr>
+          <w:p>
+            <w:r>
+              <w:t xml:space="preserve">Allow local scripts</w:t>
+            </w:r>
+          </w:p>
+        </w:tc>
+        <w:tc>
+          <w:tcPr>
+            <w:tcW w:type="dxa" w:w="2820"/>
+            <w:tcBorders>
+              <w:top w:val="single" w:color="B7C3D0" w:sz="4"/>
+              <w:left w:val="single" w:color="B7C3D0" w:sz="4"/>
+              <w:bottom w:val="single" w:color="B7C3D0" w:sz="4"/>
+              <w:right w:val="single" w:color="B7C3D0" w:sz="4"/>
+            </w:tcBorders>
+            <w:tcMar>
+              <w:top w:type="dxa" w:w="60"/>
+              <w:left w:type="dxa" w:w="100"/>
+              <w:bottom w:type="dxa" w:w="60"/>
+              <w:right w:type="dxa" w:w="100"/>
+            </w:tcMar>
+          </w:tcPr>
+          <w:p>
+            <w:r>
+              <w:rPr>
+                <w:rFonts w:ascii="Consolas" w:cs="Consolas" w:eastAsia="Consolas" w:hAnsi="Consolas"/>
+                <w:color w:val="1F3A5F"/>
+                <w:sz w:val="19"/>
+                <w:szCs w:val="19"/>
+              </w:rPr>
+              <w:t xml:space="preserve">Set-ExecutionPolicy -Scope CurrentUser RemoteSigned</w:t>
+            </w:r>
+          </w:p>
+        </w:tc>
+        <w:tc>
+          <w:tcPr>
+            <w:tcW w:type="dxa" w:w="3950"/>
+            <w:tcBorders>
+              <w:top w:val="single" w:color="B7C3D0" w:sz="4"/>
+              <w:left w:val="single" w:color="B7C3D0" w:sz="4"/>
+              <w:bottom w:val="single" w:color="B7C3D0" w:sz="4"/>
+              <w:right w:val="single" w:color="B7C3D0" w:sz="4"/>
+            </w:tcBorders>
+            <w:tcMar>
+              <w:top w:type="dxa" w:w="60"/>
+              <w:left w:type="dxa" w:w="100"/>
+              <w:bottom w:type="dxa" w:w="60"/>
+              <w:right w:type="dxa" w:w="100"/>
+            </w:tcMar>
+          </w:tcPr>
+          <w:p>
+            <w:r>
+              <w:t xml:space="preserve">Once per Windows user.</w:t>
+            </w:r>
+          </w:p>
+        </w:tc>
+      </w:tr>
+      <w:tr>
+        <w:tc>
+          <w:tcPr>
+            <w:tcW w:type="dxa" w:w="564"/>
+            <w:tcBorders>
+              <w:top w:val="single" w:color="B7C3D0" w:sz="4"/>
+              <w:left w:val="single" w:color="B7C3D0" w:sz="4"/>
+              <w:bottom w:val="single" w:color="B7C3D0" w:sz="4"/>
+              <w:right w:val="single" w:color="B7C3D0" w:sz="4"/>
+            </w:tcBorders>
+            <w:tcMar>
+              <w:top w:type="dxa" w:w="60"/>
+              <w:left w:type="dxa" w:w="100"/>
+              <w:bottom w:type="dxa" w:w="60"/>
+              <w:right w:type="dxa" w:w="100"/>
+            </w:tcMar>
+          </w:tcPr>
+          <w:p>
+            <w:r>
+              <w:t xml:space="preserve">3</w:t>
+            </w:r>
+          </w:p>
+        </w:tc>
+        <w:tc>
+          <w:tcPr>
+            <w:tcW w:type="dxa" w:w="1692"/>
+            <w:tcBorders>
+              <w:top w:val="single" w:color="B7C3D0" w:sz="4"/>
+              <w:left w:val="single" w:color="B7C3D0" w:sz="4"/>
+              <w:bottom w:val="single" w:color="B7C3D0" w:sz="4"/>
+              <w:right w:val="single" w:color="B7C3D0" w:sz="4"/>
+            </w:tcBorders>
+            <w:tcMar>
+              <w:top w:type="dxa" w:w="60"/>
+              <w:left w:type="dxa" w:w="100"/>
+              <w:bottom w:type="dxa" w:w="60"/>
+              <w:right w:type="dxa" w:w="100"/>
+            </w:tcMar>
+          </w:tcPr>
+          <w:p>
+            <w:r>
+              <w:t xml:space="preserve">Start the stack</w:t>
+            </w:r>
+          </w:p>
+        </w:tc>
+        <w:tc>
+          <w:tcPr>
+            <w:tcW w:type="dxa" w:w="2820"/>
+            <w:tcBorders>
+              <w:top w:val="single" w:color="B7C3D0" w:sz="4"/>
+              <w:left w:val="single" w:color="B7C3D0" w:sz="4"/>
+              <w:bottom w:val="single" w:color="B7C3D0" w:sz="4"/>
+              <w:right w:val="single" w:color="B7C3D0" w:sz="4"/>
+            </w:tcBorders>
+            <w:tcMar>
+              <w:top w:type="dxa" w:w="60"/>
+              <w:left w:type="dxa" w:w="100"/>
+              <w:bottom w:type="dxa" w:w="60"/>
+              <w:right w:type="dxa" w:w="100"/>
+            </w:tcMar>
+          </w:tcPr>
+          <w:p>
+            <w:r>
+              <w:rPr>
+                <w:rFonts w:ascii="Consolas" w:cs="Consolas" w:eastAsia="Consolas" w:hAnsi="Consolas"/>
+                <w:color w:val="1F3A5F"/>
+                <w:sz w:val="19"/>
+                <w:szCs w:val="19"/>
+              </w:rPr>
+              <w:t xml:space="preserve">scripts\dev.ps1</w:t>
+            </w:r>
+          </w:p>
+        </w:tc>
+        <w:tc>
+          <w:tcPr>
+            <w:tcW w:type="dxa" w:w="3950"/>
+            <w:tcBorders>
+              <w:top w:val="single" w:color="B7C3D0" w:sz="4"/>
+              <w:left w:val="single" w:color="B7C3D0" w:sz="4"/>
+              <w:bottom w:val="single" w:color="B7C3D0" w:sz="4"/>
+              <w:right w:val="single" w:color="B7C3D0" w:sz="4"/>
+            </w:tcBorders>
+            <w:tcMar>
+              <w:top w:type="dxa" w:w="60"/>
+              <w:left w:type="dxa" w:w="100"/>
+              <w:bottom w:type="dxa" w:w="60"/>
+              <w:right w:type="dxa" w:w="100"/>
+            </w:tcMar>
+          </w:tcPr>
+          <w:p>
+            <w:r>
+              <w:t xml:space="preserve">First run creates </w:t>
+            </w:r>
+            <w:r>
+              <w:rPr>
+                <w:rFonts w:ascii="Consolas" w:cs="Consolas" w:eastAsia="Consolas" w:hAnsi="Consolas"/>
+                <w:color w:val="1F3A5F"/>
+                <w:sz w:val="19"/>
+                <w:szCs w:val="19"/>
+              </w:rPr>
+              <w:t xml:space="preserve">.env</w:t>
+            </w:r>
+            <w:r>
+              <w:t xml:space="preserve"> with random secrets (</w:t>
+            </w:r>
+            <w:r>
+              <w:rPr>
+                <w:rFonts w:ascii="Consolas" w:cs="Consolas" w:eastAsia="Consolas" w:hAnsi="Consolas"/>
+                <w:color w:val="1F3A5F"/>
+                <w:sz w:val="19"/>
+                <w:szCs w:val="19"/>
+              </w:rPr>
+              <w:t xml:space="preserve">SESSION_SECRET</w:t>
+            </w:r>
+            <w:r>
+              <w:t xml:space="preserve">, </w:t>
+            </w:r>
+            <w:r>
+              <w:rPr>
+                <w:rFonts w:ascii="Consolas" w:cs="Consolas" w:eastAsia="Consolas" w:hAnsi="Consolas"/>
+                <w:color w:val="1F3A5F"/>
+                <w:sz w:val="19"/>
+                <w:szCs w:val="19"/>
+              </w:rPr>
+              <w:t xml:space="preserve">MCP_SERVICE_TOKEN</w:t>
+            </w:r>
+            <w:r>
+              <w:t xml:space="preserve">, DB passwords), builds and starts all services, and waits until healthy.</w:t>
+            </w:r>
+          </w:p>
+        </w:tc>
+      </w:tr>
+      <w:tr>
+        <w:tc>
+          <w:tcPr>
+            <w:tcW w:type="dxa" w:w="564"/>
+            <w:tcBorders>
+              <w:top w:val="single" w:color="B7C3D0" w:sz="4"/>
+              <w:left w:val="single" w:color="B7C3D0" w:sz="4"/>
+              <w:bottom w:val="single" w:color="B7C3D0" w:sz="4"/>
+              <w:right w:val="single" w:color="B7C3D0" w:sz="4"/>
+            </w:tcBorders>
+            <w:tcMar>
+              <w:top w:type="dxa" w:w="60"/>
+              <w:left w:type="dxa" w:w="100"/>
+              <w:bottom w:type="dxa" w:w="60"/>
+              <w:right w:type="dxa" w:w="100"/>
+            </w:tcMar>
+          </w:tcPr>
+          <w:p>
+            <w:r>
+              <w:t xml:space="preserve">4</w:t>
+            </w:r>
+          </w:p>
+        </w:tc>
+        <w:tc>
+          <w:tcPr>
+            <w:tcW w:type="dxa" w:w="1692"/>
+            <w:tcBorders>
+              <w:top w:val="single" w:color="B7C3D0" w:sz="4"/>
+              <w:left w:val="single" w:color="B7C3D0" w:sz="4"/>
+              <w:bottom w:val="single" w:color="B7C3D0" w:sz="4"/>
+              <w:right w:val="single" w:color="B7C3D0" w:sz="4"/>
+            </w:tcBorders>
+            <w:tcMar>
+              <w:top w:type="dxa" w:w="60"/>
+              <w:left w:type="dxa" w:w="100"/>
+              <w:bottom w:type="dxa" w:w="60"/>
+              <w:right w:type="dxa" w:w="100"/>
+            </w:tcMar>
+          </w:tcPr>
+          <w:p>
+            <w:r>
+              <w:t xml:space="preserve">Add provider keys</w:t>
+            </w:r>
+          </w:p>
+        </w:tc>
+        <w:tc>
+          <w:tcPr>
+            <w:tcW w:type="dxa" w:w="2820"/>
+            <w:tcBorders>
+              <w:top w:val="single" w:color="B7C3D0" w:sz="4"/>
+              <w:left w:val="single" w:color="B7C3D0" w:sz="4"/>
+              <w:bottom w:val="single" w:color="B7C3D0" w:sz="4"/>
+              <w:right w:val="single" w:color="B7C3D0" w:sz="4"/>
+            </w:tcBorders>
+            <w:tcMar>
+              <w:top w:type="dxa" w:w="60"/>
+              <w:left w:type="dxa" w:w="100"/>
+              <w:bottom w:type="dxa" w:w="60"/>
+              <w:right w:type="dxa" w:w="100"/>
+            </w:tcMar>
+          </w:tcPr>
+          <w:p>
+            <w:r>
+              <w:rPr>
+                <w:rFonts w:ascii="Consolas" w:cs="Consolas" w:eastAsia="Consolas" w:hAnsi="Consolas"/>
+                <w:color w:val="1F3A5F"/>
+                <w:sz w:val="19"/>
+                <w:szCs w:val="19"/>
+              </w:rPr>
+              <w:t xml:space="preserve">.env</w:t>
+            </w:r>
+            <w:r>
+              <w:t xml:space="preserve"> only (never </w:t>
+            </w:r>
+            <w:r>
+              <w:rPr>
+                <w:rFonts w:ascii="Consolas" w:cs="Consolas" w:eastAsia="Consolas" w:hAnsi="Consolas"/>
+                <w:color w:val="1F3A5F"/>
+                <w:sz w:val="19"/>
+                <w:szCs w:val="19"/>
+              </w:rPr>
+              <w:t xml:space="preserve">.env.example</w:t>
+            </w:r>
+            <w:r>
+              <w:t xml:space="preserve">)</w:t>
+            </w:r>
+          </w:p>
+        </w:tc>
+        <w:tc>
+          <w:tcPr>
+            <w:tcW w:type="dxa" w:w="3950"/>
+            <w:tcBorders>
+              <w:top w:val="single" w:color="B7C3D0" w:sz="4"/>
+              <w:left w:val="single" w:color="B7C3D0" w:sz="4"/>
+              <w:bottom w:val="single" w:color="B7C3D0" w:sz="4"/>
+              <w:right w:val="single" w:color="B7C3D0" w:sz="4"/>
+            </w:tcBorders>
+            <w:tcMar>
+              <w:top w:type="dxa" w:w="60"/>
+              <w:left w:type="dxa" w:w="100"/>
+              <w:bottom w:type="dxa" w:w="60"/>
+              <w:right w:type="dxa" w:w="100"/>
+            </w:tcMar>
+          </w:tcPr>
+          <w:p>
+            <w:r>
+              <w:rPr>
+                <w:rFonts w:ascii="Consolas" w:cs="Consolas" w:eastAsia="Consolas" w:hAnsi="Consolas"/>
+                <w:color w:val="1F3A5F"/>
+                <w:sz w:val="19"/>
+                <w:szCs w:val="19"/>
+              </w:rPr>
+              <w:t xml:space="preserve">ANTHROPIC_API_KEY</w:t>
+            </w:r>
+            <w:r>
+              <w:t xml:space="preserve">, </w:t>
+            </w:r>
+            <w:r>
+              <w:rPr>
+                <w:rFonts w:ascii="Consolas" w:cs="Consolas" w:eastAsia="Consolas" w:hAnsi="Consolas"/>
+                <w:color w:val="1F3A5F"/>
+                <w:sz w:val="19"/>
+                <w:szCs w:val="19"/>
+              </w:rPr>
+              <w:t xml:space="preserve">ALPHAVANTAGE_API_KEY</w:t>
+            </w:r>
+            <w:r>
+              <w:t xml:space="preserve">, </w:t>
+            </w:r>
+            <w:r>
+              <w:rPr>
+                <w:rFonts w:ascii="Consolas" w:cs="Consolas" w:eastAsia="Consolas" w:hAnsi="Consolas"/>
+                <w:color w:val="1F3A5F"/>
+                <w:sz w:val="19"/>
+                <w:szCs w:val="19"/>
+              </w:rPr>
+              <w:t xml:space="preserve">TAVILY_API_KEY</w:t>
+            </w:r>
+            <w:r>
+              <w:t xml:space="preserve">; optional </w:t>
+            </w:r>
+            <w:r>
+              <w:rPr>
+                <w:rFonts w:ascii="Consolas" w:cs="Consolas" w:eastAsia="Consolas" w:hAnsi="Consolas"/>
+                <w:color w:val="1F3A5F"/>
+                <w:sz w:val="19"/>
+                <w:szCs w:val="19"/>
+              </w:rPr>
+              <w:t xml:space="preserve">LANGSMITH_API_KEY</w:t>
+            </w:r>
+            <w:r>
+              <w:t xml:space="preserve">. Comments go on their own lines. Restart with </w:t>
+            </w:r>
+            <w:r>
+              <w:rPr>
+                <w:rFonts w:ascii="Consolas" w:cs="Consolas" w:eastAsia="Consolas" w:hAnsi="Consolas"/>
+                <w:color w:val="1F3A5F"/>
+                <w:sz w:val="19"/>
+                <w:szCs w:val="19"/>
+              </w:rPr>
+              <w:t xml:space="preserve">docker compose up -d api worker mcp</w:t>
+            </w:r>
+            <w:r>
+              <w:t xml:space="preserve">.</w:t>
+            </w:r>
+          </w:p>
+        </w:tc>
+      </w:tr>
+      <w:tr>
+        <w:tc>
+          <w:tcPr>
+            <w:tcW w:type="dxa" w:w="564"/>
+            <w:tcBorders>
+              <w:top w:val="single" w:color="B7C3D0" w:sz="4"/>
+              <w:left w:val="single" w:color="B7C3D0" w:sz="4"/>
+              <w:bottom w:val="single" w:color="B7C3D0" w:sz="4"/>
+              <w:right w:val="single" w:color="B7C3D0" w:sz="4"/>
+            </w:tcBorders>
+            <w:tcMar>
+              <w:top w:type="dxa" w:w="60"/>
+              <w:left w:type="dxa" w:w="100"/>
+              <w:bottom w:type="dxa" w:w="60"/>
+              <w:right w:type="dxa" w:w="100"/>
+            </w:tcMar>
+          </w:tcPr>
+          <w:p>
+            <w:r>
+              <w:t xml:space="preserve">5</w:t>
+            </w:r>
+          </w:p>
+        </w:tc>
+        <w:tc>
+          <w:tcPr>
+            <w:tcW w:type="dxa" w:w="1692"/>
+            <w:tcBorders>
+              <w:top w:val="single" w:color="B7C3D0" w:sz="4"/>
+              <w:left w:val="single" w:color="B7C3D0" w:sz="4"/>
+              <w:bottom w:val="single" w:color="B7C3D0" w:sz="4"/>
+              <w:right w:val="single" w:color="B7C3D0" w:sz="4"/>
+            </w:tcBorders>
+            <w:tcMar>
+              <w:top w:type="dxa" w:w="60"/>
+              <w:left w:type="dxa" w:w="100"/>
+              <w:bottom w:type="dxa" w:w="60"/>
+              <w:right w:type="dxa" w:w="100"/>
+            </w:tcMar>
+          </w:tcPr>
+          <w:p>
+            <w:r>
+              <w:t xml:space="preserve">Migrate and seed</w:t>
+            </w:r>
+          </w:p>
+        </w:tc>
+        <w:tc>
+          <w:tcPr>
+            <w:tcW w:type="dxa" w:w="2820"/>
+            <w:tcBorders>
+              <w:top w:val="single" w:color="B7C3D0" w:sz="4"/>
+              <w:left w:val="single" w:color="B7C3D0" w:sz="4"/>
+              <w:bottom w:val="single" w:color="B7C3D0" w:sz="4"/>
+              <w:right w:val="single" w:color="B7C3D0" w:sz="4"/>
+            </w:tcBorders>
+            <w:tcMar>
+              <w:top w:type="dxa" w:w="60"/>
+              <w:left w:type="dxa" w:w="100"/>
+              <w:bottom w:type="dxa" w:w="60"/>
+              <w:right w:type="dxa" w:w="100"/>
+            </w:tcMar>
+          </w:tcPr>
+          <w:p>
+            <w:r>
+              <w:rPr>
+                <w:rFonts w:ascii="Consolas" w:cs="Consolas" w:eastAsia="Consolas" w:hAnsi="Consolas"/>
+                <w:color w:val="1F3A5F"/>
+                <w:sz w:val="19"/>
+                <w:szCs w:val="19"/>
+              </w:rPr>
+              <w:t xml:space="preserve">scripts\seed.ps1</w:t>
+            </w:r>
+          </w:p>
+        </w:tc>
+        <w:tc>
+          <w:tcPr>
+            <w:tcW w:type="dxa" w:w="3950"/>
+            <w:tcBorders>
+              <w:top w:val="single" w:color="B7C3D0" w:sz="4"/>
+              <w:left w:val="single" w:color="B7C3D0" w:sz="4"/>
+              <w:bottom w:val="single" w:color="B7C3D0" w:sz="4"/>
+              <w:right w:val="single" w:color="B7C3D0" w:sz="4"/>
+            </w:tcBorders>
+            <w:tcMar>
+              <w:top w:type="dxa" w:w="60"/>
+              <w:left w:type="dxa" w:w="100"/>
+              <w:bottom w:type="dxa" w:w="60"/>
+              <w:right w:type="dxa" w:w="100"/>
+            </w:tcMar>
+          </w:tcPr>
+          <w:p>
+            <w:r>
+              <w:t xml:space="preserve">Runs migrations as </w:t>
+            </w:r>
+            <w:r>
+              <w:rPr>
+                <w:rFonts w:ascii="Consolas" w:cs="Consolas" w:eastAsia="Consolas" w:hAnsi="Consolas"/>
+                <w:color w:val="1F3A5F"/>
+                <w:sz w:val="19"/>
+                <w:szCs w:val="19"/>
+              </w:rPr>
+              <w:t xml:space="preserve">alloyiq_migrator</w:t>
+            </w:r>
+            <w:r>
+              <w:t xml:space="preserve">, then seeds the Demo plan, model profiles, draft rate card v1 and the instrument catalogue. Safe to re-run.</w:t>
+            </w:r>
+          </w:p>
+        </w:tc>
+      </w:tr>
+      <w:tr>
+        <w:tc>
+          <w:tcPr>
+            <w:tcW w:type="dxa" w:w="564"/>
+            <w:tcBorders>
+              <w:top w:val="single" w:color="B7C3D0" w:sz="4"/>
+              <w:left w:val="single" w:color="B7C3D0" w:sz="4"/>
+              <w:bottom w:val="single" w:color="B7C3D0" w:sz="4"/>
+              <w:right w:val="single" w:color="B7C3D0" w:sz="4"/>
+            </w:tcBorders>
+            <w:tcMar>
+              <w:top w:type="dxa" w:w="60"/>
+              <w:left w:type="dxa" w:w="100"/>
+              <w:bottom w:type="dxa" w:w="60"/>
+              <w:right w:type="dxa" w:w="100"/>
+            </w:tcMar>
+          </w:tcPr>
+          <w:p>
+            <w:r>
+              <w:t xml:space="preserve">6</w:t>
+            </w:r>
+          </w:p>
+        </w:tc>
+        <w:tc>
+          <w:tcPr>
+            <w:tcW w:type="dxa" w:w="1692"/>
+            <w:tcBorders>
+              <w:top w:val="single" w:color="B7C3D0" w:sz="4"/>
+              <w:left w:val="single" w:color="B7C3D0" w:sz="4"/>
+              <w:bottom w:val="single" w:color="B7C3D0" w:sz="4"/>
+              <w:right w:val="single" w:color="B7C3D0" w:sz="4"/>
+            </w:tcBorders>
+            <w:tcMar>
+              <w:top w:type="dxa" w:w="60"/>
+              <w:left w:type="dxa" w:w="100"/>
+              <w:bottom w:type="dxa" w:w="60"/>
+              <w:right w:type="dxa" w:w="100"/>
+            </w:tcMar>
+          </w:tcPr>
+          <w:p>
+            <w:r>
+              <w:t xml:space="preserve">Verify the catalogue</w:t>
+            </w:r>
+          </w:p>
+        </w:tc>
+        <w:tc>
+          <w:tcPr>
+            <w:tcW w:type="dxa" w:w="2820"/>
+            <w:tcBorders>
+              <w:top w:val="single" w:color="B7C3D0" w:sz="4"/>
+              <w:left w:val="single" w:color="B7C3D0" w:sz="4"/>
+              <w:bottom w:val="single" w:color="B7C3D0" w:sz="4"/>
+              <w:right w:val="single" w:color="B7C3D0" w:sz="4"/>
+            </w:tcBorders>
+            <w:tcMar>
+              <w:top w:type="dxa" w:w="60"/>
+              <w:left w:type="dxa" w:w="100"/>
+              <w:bottom w:type="dxa" w:w="60"/>
+              <w:right w:type="dxa" w:w="100"/>
+            </w:tcMar>
+          </w:tcPr>
+          <w:p>
+            <w:r>
+              <w:rPr>
+                <w:rFonts w:ascii="Consolas" w:cs="Consolas" w:eastAsia="Consolas" w:hAnsi="Consolas"/>
+                <w:color w:val="1F3A5F"/>
+                <w:sz w:val="19"/>
+                <w:szCs w:val="19"/>
+              </w:rPr>
+              <w:t xml:space="preserve">alloyiq-admin catalog-verify --live --apply</w:t>
+            </w:r>
+          </w:p>
+        </w:tc>
+        <w:tc>
+          <w:tcPr>
+            <w:tcW w:type="dxa" w:w="3950"/>
+            <w:tcBorders>
+              <w:top w:val="single" w:color="B7C3D0" w:sz="4"/>
+              <w:left w:val="single" w:color="B7C3D0" w:sz="4"/>
+              <w:bottom w:val="single" w:color="B7C3D0" w:sz="4"/>
+              <w:right w:val="single" w:color="B7C3D0" w:sz="4"/>
+            </w:tcBorders>
+            <w:tcMar>
+              <w:top w:type="dxa" w:w="60"/>
+              <w:left w:type="dxa" w:w="100"/>
+              <w:bottom w:type="dxa" w:w="60"/>
+              <w:right w:type="dxa" w:w="100"/>
+            </w:tcMar>
+          </w:tcPr>
+          <w:p>
+            <w:r>
+              <w:t xml:space="preserve">Needs </w:t>
+            </w:r>
+            <w:r>
+              <w:rPr>
+                <w:rFonts w:ascii="Consolas" w:cs="Consolas" w:eastAsia="Consolas" w:hAnsi="Consolas"/>
+                <w:color w:val="1F3A5F"/>
+                <w:sz w:val="19"/>
+                <w:szCs w:val="19"/>
+              </w:rPr>
+              <w:t xml:space="preserve">LIVE_PROVIDER_TESTS=1</w:t>
+            </w:r>
+            <w:r>
+              <w:t xml:space="preserve">. Checks each instrument against real providers; failing ones are disabled with a reason. </w:t>
+            </w:r>
+            <w:r>
+              <w:rPr>
+                <w:rFonts w:ascii="Consolas" w:cs="Consolas" w:eastAsia="Consolas" w:hAnsi="Consolas"/>
+                <w:color w:val="1F3A5F"/>
+                <w:sz w:val="19"/>
+                <w:szCs w:val="19"/>
+              </w:rPr>
+              <w:t xml:space="preserve">--instrument</w:t>
+            </w:r>
+            <w:r>
+              <w:t xml:space="preserve"> re-checks one.</w:t>
+            </w:r>
+          </w:p>
+        </w:tc>
+      </w:tr>
+      <w:tr>
+        <w:tc>
+          <w:tcPr>
+            <w:tcW w:type="dxa" w:w="564"/>
+            <w:tcBorders>
+              <w:top w:val="single" w:color="B7C3D0" w:sz="4"/>
+              <w:left w:val="single" w:color="B7C3D0" w:sz="4"/>
+              <w:bottom w:val="single" w:color="B7C3D0" w:sz="4"/>
+              <w:right w:val="single" w:color="B7C3D0" w:sz="4"/>
+            </w:tcBorders>
+            <w:tcMar>
+              <w:top w:type="dxa" w:w="60"/>
+              <w:left w:type="dxa" w:w="100"/>
+              <w:bottom w:type="dxa" w:w="60"/>
+              <w:right w:type="dxa" w:w="100"/>
+            </w:tcMar>
+          </w:tcPr>
+          <w:p>
+            <w:r>
+              <w:t xml:space="preserve">7</w:t>
+            </w:r>
+          </w:p>
+        </w:tc>
+        <w:tc>
+          <w:tcPr>
+            <w:tcW w:type="dxa" w:w="1692"/>
+            <w:tcBorders>
+              <w:top w:val="single" w:color="B7C3D0" w:sz="4"/>
+              <w:left w:val="single" w:color="B7C3D0" w:sz="4"/>
+              <w:bottom w:val="single" w:color="B7C3D0" w:sz="4"/>
+              <w:right w:val="single" w:color="B7C3D0" w:sz="4"/>
+            </w:tcBorders>
+            <w:tcMar>
+              <w:top w:type="dxa" w:w="60"/>
+              <w:left w:type="dxa" w:w="100"/>
+              <w:bottom w:type="dxa" w:w="60"/>
+              <w:right w:type="dxa" w:w="100"/>
+            </w:tcMar>
+          </w:tcPr>
+          <w:p>
+            <w:r>
+              <w:t xml:space="preserve">Activate the rate card</w:t>
+            </w:r>
+          </w:p>
+        </w:tc>
+        <w:tc>
+          <w:tcPr>
+            <w:tcW w:type="dxa" w:w="2820"/>
+            <w:tcBorders>
+              <w:top w:val="single" w:color="B7C3D0" w:sz="4"/>
+              <w:left w:val="single" w:color="B7C3D0" w:sz="4"/>
+              <w:bottom w:val="single" w:color="B7C3D0" w:sz="4"/>
+              <w:right w:val="single" w:color="B7C3D0" w:sz="4"/>
+            </w:tcBorders>
+            <w:tcMar>
+              <w:top w:type="dxa" w:w="60"/>
+              <w:left w:type="dxa" w:w="100"/>
+              <w:bottom w:type="dxa" w:w="60"/>
+              <w:right w:type="dxa" w:w="100"/>
+            </w:tcMar>
+          </w:tcPr>
+          <w:p>
+            <w:r>
+              <w:rPr>
+                <w:rFonts w:ascii="Consolas" w:cs="Consolas" w:eastAsia="Consolas" w:hAnsi="Consolas"/>
+                <w:color w:val="1F3A5F"/>
+                <w:sz w:val="19"/>
+                <w:szCs w:val="19"/>
+              </w:rPr>
+              <w:t xml:space="preserve">alloyiq-admin rate-card-activate v1-2026-10-06 --confirm-prices-verified</w:t>
+            </w:r>
+          </w:p>
+        </w:tc>
+        <w:tc>
+          <w:tcPr>
+            <w:tcW w:type="dxa" w:w="3950"/>
+            <w:tcBorders>
+              <w:top w:val="single" w:color="B7C3D0" w:sz="4"/>
+              <w:left w:val="single" w:color="B7C3D0" w:sz="4"/>
+              <w:bottom w:val="single" w:color="B7C3D0" w:sz="4"/>
+              <w:right w:val="single" w:color="B7C3D0" w:sz="4"/>
+            </w:tcBorders>
+            <w:tcMar>
+              <w:top w:type="dxa" w:w="60"/>
+              <w:left w:type="dxa" w:w="100"/>
+              <w:bottom w:type="dxa" w:w="60"/>
+              <w:right w:type="dxa" w:w="100"/>
+            </w:tcMar>
+          </w:tcPr>
+          <w:p>
+            <w:r>
+              <w:t xml:space="preserve">Only after checking each price against Anthropic's pricing page; active cards are immutable.</w:t>
+            </w:r>
+          </w:p>
+        </w:tc>
+      </w:tr>
+      <w:tr>
+        <w:tc>
+          <w:tcPr>
+            <w:tcW w:type="dxa" w:w="564"/>
+            <w:tcBorders>
+              <w:top w:val="single" w:color="B7C3D0" w:sz="4"/>
+              <w:left w:val="single" w:color="B7C3D0" w:sz="4"/>
+              <w:bottom w:val="single" w:color="B7C3D0" w:sz="4"/>
+              <w:right w:val="single" w:color="B7C3D0" w:sz="4"/>
+            </w:tcBorders>
+            <w:tcMar>
+              <w:top w:type="dxa" w:w="60"/>
+              <w:left w:type="dxa" w:w="100"/>
+              <w:bottom w:type="dxa" w:w="60"/>
+              <w:right w:type="dxa" w:w="100"/>
+            </w:tcMar>
+          </w:tcPr>
+          <w:p>
+            <w:r>
+              <w:t xml:space="preserve">8</w:t>
+            </w:r>
+          </w:p>
+        </w:tc>
+        <w:tc>
+          <w:tcPr>
+            <w:tcW w:type="dxa" w:w="1692"/>
+            <w:tcBorders>
+              <w:top w:val="single" w:color="B7C3D0" w:sz="4"/>
+              <w:left w:val="single" w:color="B7C3D0" w:sz="4"/>
+              <w:bottom w:val="single" w:color="B7C3D0" w:sz="4"/>
+              <w:right w:val="single" w:color="B7C3D0" w:sz="4"/>
+            </w:tcBorders>
+            <w:tcMar>
+              <w:top w:type="dxa" w:w="60"/>
+              <w:left w:type="dxa" w:w="100"/>
+              <w:bottom w:type="dxa" w:w="60"/>
+              <w:right w:type="dxa" w:w="100"/>
+            </w:tcMar>
+          </w:tcPr>
+          <w:p>
+            <w:r>
+              <w:t xml:space="preserve">Check spend caps</w:t>
+            </w:r>
+          </w:p>
+        </w:tc>
+        <w:tc>
+          <w:tcPr>
+            <w:tcW w:type="dxa" w:w="2820"/>
+            <w:tcBorders>
+              <w:top w:val="single" w:color="B7C3D0" w:sz="4"/>
+              <w:left w:val="single" w:color="B7C3D0" w:sz="4"/>
+              <w:bottom w:val="single" w:color="B7C3D0" w:sz="4"/>
+              <w:right w:val="single" w:color="B7C3D0" w:sz="4"/>
+            </w:tcBorders>
+            <w:tcMar>
+              <w:top w:type="dxa" w:w="60"/>
+              <w:left w:type="dxa" w:w="100"/>
+              <w:bottom w:type="dxa" w:w="60"/>
+              <w:right w:type="dxa" w:w="100"/>
+            </w:tcMar>
+          </w:tcPr>
+          <w:p>
+            <w:r>
+              <w:rPr>
+                <w:rFonts w:ascii="Consolas" w:cs="Consolas" w:eastAsia="Consolas" w:hAnsi="Consolas"/>
+                <w:color w:val="1F3A5F"/>
+                <w:sz w:val="19"/>
+                <w:szCs w:val="19"/>
+              </w:rPr>
+              <w:t xml:space="preserve">REAL_SPEND_*</w:t>
+            </w:r>
+            <w:r>
+              <w:t xml:space="preserve"> in </w:t>
+            </w:r>
+            <w:r>
+              <w:rPr>
+                <w:rFonts w:ascii="Consolas" w:cs="Consolas" w:eastAsia="Consolas" w:hAnsi="Consolas"/>
+                <w:color w:val="1F3A5F"/>
+                <w:sz w:val="19"/>
+                <w:szCs w:val="19"/>
+              </w:rPr>
+              <w:t xml:space="preserve">.env</w:t>
+            </w:r>
+          </w:p>
+        </w:tc>
+        <w:tc>
+          <w:tcPr>
+            <w:tcW w:type="dxa" w:w="3950"/>
+            <w:tcBorders>
+              <w:top w:val="single" w:color="B7C3D0" w:sz="4"/>
+              <w:left w:val="single" w:color="B7C3D0" w:sz="4"/>
+              <w:bottom w:val="single" w:color="B7C3D0" w:sz="4"/>
+              <w:right w:val="single" w:color="B7C3D0" w:sz="4"/>
+            </w:tcBorders>
+            <w:tcMar>
+              <w:top w:type="dxa" w:w="60"/>
+              <w:left w:type="dxa" w:w="100"/>
+              <w:bottom w:type="dxa" w:w="60"/>
+              <w:right w:type="dxa" w:w="100"/>
+            </w:tcMar>
+          </w:tcPr>
+          <w:p>
+            <w:r>
+              <w:t xml:space="preserve">Defaults: USD 1.50 per run, 5.00 per account-day, 20.00 per platform-day.</w:t>
+            </w:r>
+          </w:p>
+        </w:tc>
+      </w:tr>
+      <w:tr>
+        <w:tc>
+          <w:tcPr>
+            <w:tcW w:type="dxa" w:w="564"/>
+            <w:tcBorders>
+              <w:top w:val="single" w:color="B7C3D0" w:sz="4"/>
+              <w:left w:val="single" w:color="B7C3D0" w:sz="4"/>
+              <w:bottom w:val="single" w:color="B7C3D0" w:sz="4"/>
+              <w:right w:val="single" w:color="B7C3D0" w:sz="4"/>
+            </w:tcBorders>
+            <w:tcMar>
+              <w:top w:type="dxa" w:w="60"/>
+              <w:left w:type="dxa" w:w="100"/>
+              <w:bottom w:type="dxa" w:w="60"/>
+              <w:right w:type="dxa" w:w="100"/>
+            </w:tcMar>
+          </w:tcPr>
+          <w:p>
+            <w:r>
+              <w:t xml:space="preserve">9</w:t>
+            </w:r>
+          </w:p>
+        </w:tc>
+        <w:tc>
+          <w:tcPr>
+            <w:tcW w:type="dxa" w:w="1692"/>
+            <w:tcBorders>
+              <w:top w:val="single" w:color="B7C3D0" w:sz="4"/>
+              <w:left w:val="single" w:color="B7C3D0" w:sz="4"/>
+              <w:bottom w:val="single" w:color="B7C3D0" w:sz="4"/>
+              <w:right w:val="single" w:color="B7C3D0" w:sz="4"/>
+            </w:tcBorders>
+            <w:tcMar>
+              <w:top w:type="dxa" w:w="60"/>
+              <w:left w:type="dxa" w:w="100"/>
+              <w:bottom w:type="dxa" w:w="60"/>
+              <w:right w:type="dxa" w:w="100"/>
+            </w:tcMar>
+          </w:tcPr>
+          <w:p>
+            <w:r>
+              <w:t xml:space="preserve">Smoke test</w:t>
+            </w:r>
+          </w:p>
+        </w:tc>
+        <w:tc>
+          <w:tcPr>
+            <w:tcW w:type="dxa" w:w="2820"/>
+            <w:tcBorders>
+              <w:top w:val="single" w:color="B7C3D0" w:sz="4"/>
+              <w:left w:val="single" w:color="B7C3D0" w:sz="4"/>
+              <w:bottom w:val="single" w:color="B7C3D0" w:sz="4"/>
+              <w:right w:val="single" w:color="B7C3D0" w:sz="4"/>
+            </w:tcBorders>
+            <w:tcMar>
+              <w:top w:type="dxa" w:w="60"/>
+              <w:left w:type="dxa" w:w="100"/>
+              <w:bottom w:type="dxa" w:w="60"/>
+              <w:right w:type="dxa" w:w="100"/>
+            </w:tcMar>
+          </w:tcPr>
+          <w:p>
+            <w:r>
+              <w:rPr>
+                <w:rFonts w:ascii="Consolas" w:cs="Consolas" w:eastAsia="Consolas" w:hAnsi="Consolas"/>
+                <w:color w:val="1F3A5F"/>
+                <w:sz w:val="19"/>
+                <w:szCs w:val="19"/>
+              </w:rPr>
+              <w:t xml:space="preserve">alloyiq-admin eval</w:t>
+            </w:r>
+            <w:r>
+              <w:t xml:space="preserve">, then one run at http://localhost:8080</w:t>
+            </w:r>
+          </w:p>
+        </w:tc>
+        <w:tc>
+          <w:tcPr>
+            <w:tcW w:type="dxa" w:w="3950"/>
+            <w:tcBorders>
+              <w:top w:val="single" w:color="B7C3D0" w:sz="4"/>
+              <w:left w:val="single" w:color="B7C3D0" w:sz="4"/>
+              <w:bottom w:val="single" w:color="B7C3D0" w:sz="4"/>
+              <w:right w:val="single" w:color="B7C3D0" w:sz="4"/>
+            </w:tcBorders>
+            <w:tcMar>
+              <w:top w:type="dxa" w:w="60"/>
+              <w:left w:type="dxa" w:w="100"/>
+              <w:bottom w:type="dxa" w:w="60"/>
+              <w:right w:type="dxa" w:w="100"/>
+            </w:tcMar>
+          </w:tcPr>
+          <w:p>
+            <w:r>
+              <w:t xml:space="preserve">Offline eval must report </w:t>
+            </w:r>
+            <w:r>
+              <w:rPr>
+                <w:rFonts w:ascii="Consolas" w:cs="Consolas" w:eastAsia="Consolas" w:hAnsi="Consolas"/>
+                <w:color w:val="1F3A5F"/>
+                <w:sz w:val="19"/>
+                <w:szCs w:val="19"/>
+              </w:rPr>
+              <w:t xml:space="preserve">release_gates_passed: true</w:t>
+            </w:r>
+            <w:r>
+              <w:t xml:space="preserve">; </w:t>
+            </w:r>
+            <w:r>
+              <w:rPr>
+                <w:rFonts w:ascii="Consolas" w:cs="Consolas" w:eastAsia="Consolas" w:hAnsi="Consolas"/>
+                <w:color w:val="1F3A5F"/>
+                <w:sz w:val="19"/>
+                <w:szCs w:val="19"/>
+              </w:rPr>
+              <w:t xml:space="preserve">eval --live</w:t>
+            </w:r>
+            <w:r>
+              <w:t xml:space="preserve"> costs real money.</w:t>
+            </w:r>
+          </w:p>
+        </w:tc>
+      </w:tr>
+    </w:tbl>
+    <w:p>
+      <w:pPr>
+        <w:spacing w:after="120"/>
+      </w:pPr>
+    </w:p>
+    <w:p>
+      <w:pPr>
+        <w:spacing w:after="120"/>
+      </w:pPr>
+      <w:r>
+        <w:t xml:space="preserve">Admin commands run inside the API container: </w:t>
+      </w:r>
+      <w:r>
+        <w:rPr>
+          <w:rFonts w:ascii="Consolas" w:cs="Consolas" w:eastAsia="Consolas" w:hAnsi="Consolas"/>
+          <w:color w:val="1F3A5F"/>
+          <w:sz w:val="19"/>
+          <w:szCs w:val="19"/>
+        </w:rPr>
+        <w:t xml:space="preserve">docker compose exec api alloyiq-admin &lt;command&gt;</w:t>
+      </w:r>
+      <w:r>
+        <w:t xml:space="preserve">. Daily checks and incident procedures are in </w:t>
+      </w:r>
+      <w:r>
+        <w:rPr>
+          <w:rFonts w:ascii="Consolas" w:cs="Consolas" w:eastAsia="Consolas" w:hAnsi="Consolas"/>
+          <w:color w:val="1F3A5F"/>
+          <w:sz w:val="19"/>
+          <w:szCs w:val="19"/>
+        </w:rPr>
+        <w:t xml:space="preserve">docs/ops/runbook.md</w:t>
       </w:r>
       <w:r>
         <w:t xml:space="preserve">.</w:t>

</xml_diff>

<commit_message>
Hosted deploy: Vercel frontend + Render backend; Gmail SMTP; docs
- SMTP login + STARTTLS for hosted email (Gmail app password)
- TOOL_GATEWAY=in_process and ARTIFACT_BACKEND=postgres (migration 0006) for Render (DV-15)
- render.yaml Blueprint; alloyiq.cli.render exec/predeploy builds role URLs and bootstraps roles
- Vercel /api rewrite via API_ORIGIN; prod requires an https PUBLIC_ORIGIN
- docs/ops/deploy-render-vercel.md; IntrAI agentic SaaS - processes etc.docx
- test_duplicate_business_event_rejected no longer needs a reset database

Co-Authored-By: Claude Opus 5.5 <noreply@anthropic.com>
</commit_message>
<xml_diff>
--- a/docs/Agentic AI SaaS - Workflows etc.docx
+++ b/docs/Agentic AI SaaS - Workflows etc.docx
@@ -15568,7 +15568,19 @@
         <w:t xml:space="preserve">0005_privacy_purge</w:t>
       </w:r>
       <w:r>
-        <w:t xml:space="preserve">. Each has a working downgrade, tested down-and-up.</w:t>
+        <w:t xml:space="preserve">, </w:t>
+      </w:r>
+      <w:r>
+        <w:rPr>
+          <w:rFonts w:ascii="Consolas" w:cs="Consolas" w:eastAsia="Consolas" w:hAnsi="Consolas"/>
+          <w:color w:val="1F3A5F"/>
+          <w:sz w:val="19"/>
+          <w:szCs w:val="19"/>
+        </w:rPr>
+        <w:t xml:space="preserve">0006_artifact_content</w:t>
+      </w:r>
+      <w:r>
+        <w:t xml:space="preserve"> (artifact bytes for hosted deploys, DV-15). Each has a working downgrade, tested down-and-up.</w:t>
       </w:r>
     </w:p>
     <w:p>

</xml_diff>

<commit_message>
Hosted: run the MCP tool server inside the worker container
alloyiq.cli.render worker starts MCP on 127.0.0.1:8100, waits for /health, then the
worker; if either exits both stop so Render restarts the container. The worker keeps
calling tools over MCP with the service token; TOOL_GATEWAY=in_process stays a fallback.

Co-Authored-By: Claude Opus 5.5 <noreply@anthropic.com>
</commit_message>
<xml_diff>
--- a/docs/Agentic AI SaaS - Workflows etc.docx
+++ b/docs/Agentic AI SaaS - Workflows etc.docx
@@ -15141,7 +15141,19 @@
         <w:t xml:space="preserve">InProcessToolGateway</w:t>
       </w:r>
       <w:r>
-        <w:t xml:space="preserve"> is the same interface without the network, used by tests and the eval harness.</w:t>
+        <w:t xml:space="preserve"> is the same interface without the network, used by tests, the eval harness and as a hosted fallback (</w:t>
+      </w:r>
+      <w:r>
+        <w:rPr>
+          <w:rFonts w:ascii="Consolas" w:cs="Consolas" w:eastAsia="Consolas" w:hAnsi="Consolas"/>
+          <w:color w:val="1F3A5F"/>
+          <w:sz w:val="19"/>
+          <w:szCs w:val="19"/>
+        </w:rPr>
+        <w:t xml:space="preserve">TOOL_GATEWAY=in_process</w:t>
+      </w:r>
+      <w:r>
+        <w:t xml:space="preserve">). On Render the MCP server runs inside the worker's container on localhost (DV-15).</w:t>
       </w:r>
     </w:p>
     <w:p>

</xml_diff>